<commit_message>
Travail du 16 Fevrier
</commit_message>
<xml_diff>
--- a/Views/Rapport.docx
+++ b/Views/Rapport.docx
@@ -3960,9 +3960,9 @@
           <w:noProof/>
         </w:rPr>
         <w:drawing>
-          <wp:inline distT="0" distB="0" distL="0" distR="0" wp14:anchorId="495EFAC1" wp14:editId="1C8C2996">
-            <wp:extent cx="3599812" cy="2699859"/>
-            <wp:effectExtent l="0" t="0" r="1270" b="5715"/>
+          <wp:inline distT="0" distB="0" distL="0" distR="0" wp14:anchorId="495EFAC1" wp14:editId="0A129456">
+            <wp:extent cx="3599997" cy="2699998"/>
+            <wp:effectExtent l="0" t="0" r="635" b="5715"/>
             <wp:docPr id="86543578" name="Picture 2"/>
             <wp:cNvGraphicFramePr>
               <a:graphicFrameLocks xmlns:a="http://schemas.openxmlformats.org/drawingml/2006/main" noChangeAspect="1"/>
@@ -3971,18 +3971,18 @@
               <a:graphicData uri="http://schemas.openxmlformats.org/drawingml/2006/picture">
                 <pic:pic xmlns:pic="http://schemas.openxmlformats.org/drawingml/2006/picture">
                   <pic:nvPicPr>
-                    <pic:cNvPr id="86543578" name="Picture 86543578"/>
+                    <pic:cNvPr id="86543578" name="Picture 2"/>
                     <pic:cNvPicPr/>
                   </pic:nvPicPr>
-                  <pic:blipFill rotWithShape="1">
-                    <a:blip r:embed="rId10" cstate="print">
+                  <pic:blipFill>
+                    <a:blip r:embed="rId10">
                       <a:extLst>
                         <a:ext uri="{28A0092B-C50C-407E-A947-70E740481C1C}">
                           <a14:useLocalDpi xmlns:a14="http://schemas.microsoft.com/office/drawing/2010/main" val="0"/>
                         </a:ext>
                       </a:extLst>
                     </a:blip>
-                    <a:srcRect l="-192" t="19044" r="192" b="5956"/>
+                    <a:srcRect t="12500" b="12500"/>
                     <a:stretch>
                       <a:fillRect/>
                     </a:stretch>
@@ -4384,19 +4384,13 @@
               </m:oMathParaPr>
               <m:oMath>
                 <m:r>
-                  <w:rPr>
-                    <w:rFonts w:ascii="Cambria Math" w:hAnsi="Cambria Math"/>
-                  </w:rPr>
-                  <m:t>5,3 k</m:t>
-                </m:r>
-                <m:r>
                   <m:rPr>
                     <m:sty m:val="p"/>
                   </m:rPr>
                   <w:rPr>
                     <w:rFonts w:ascii="Cambria Math" w:hAnsi="Cambria Math"/>
                   </w:rPr>
-                  <m:t>Ω</m:t>
+                  <m:t>5,26 kΩ</m:t>
                 </m:r>
               </m:oMath>
             </m:oMathPara>
@@ -4417,10 +4411,13 @@
               </m:oMathParaPr>
               <m:oMath>
                 <m:r>
+                  <m:rPr>
+                    <m:sty m:val="p"/>
+                  </m:rPr>
                   <w:rPr>
                     <w:rFonts w:ascii="Cambria Math" w:hAnsi="Cambria Math"/>
                   </w:rPr>
-                  <m:t>2,40 H</m:t>
+                  <m:t>2,43 H</m:t>
                 </m:r>
               </m:oMath>
             </m:oMathPara>
@@ -4441,6 +4438,9 @@
               </m:oMathParaPr>
               <m:oMath>
                 <m:r>
+                  <m:rPr>
+                    <m:sty m:val="p"/>
+                  </m:rPr>
                   <w:rPr>
                     <w:rFonts w:ascii="Cambria Math" w:hAnsi="Cambria Math"/>
                   </w:rPr>
@@ -4465,19 +4465,13 @@
               </m:oMathParaPr>
               <m:oMath>
                 <m:r>
-                  <w:rPr>
-                    <w:rFonts w:ascii="Cambria Math" w:hAnsi="Cambria Math"/>
-                  </w:rPr>
-                  <m:t>507,5 k</m:t>
-                </m:r>
-                <m:r>
                   <m:rPr>
                     <m:sty m:val="p"/>
                   </m:rPr>
                   <w:rPr>
                     <w:rFonts w:ascii="Cambria Math" w:hAnsi="Cambria Math"/>
                   </w:rPr>
-                  <m:t>Ω</m:t>
+                  <m:t>499,6 kΩ</m:t>
                 </m:r>
               </m:oMath>
             </m:oMathPara>
@@ -4516,19 +4510,13 @@
               </m:oMathParaPr>
               <m:oMath>
                 <m:r>
-                  <w:rPr>
-                    <w:rFonts w:ascii="Cambria Math" w:hAnsi="Cambria Math"/>
-                  </w:rPr>
-                  <m:t>4,52 k</m:t>
-                </m:r>
-                <m:r>
                   <m:rPr>
                     <m:sty m:val="p"/>
                   </m:rPr>
                   <w:rPr>
                     <w:rFonts w:ascii="Cambria Math" w:hAnsi="Cambria Math"/>
                   </w:rPr>
-                  <m:t>Ω</m:t>
+                  <m:t>4,52 kΩ</m:t>
                 </m:r>
               </m:oMath>
             </m:oMathPara>
@@ -4549,10 +4537,13 @@
               </m:oMathParaPr>
               <m:oMath>
                 <m:r>
+                  <m:rPr>
+                    <m:sty m:val="p"/>
+                  </m:rPr>
                   <w:rPr>
                     <w:rFonts w:ascii="Cambria Math" w:hAnsi="Cambria Math"/>
                   </w:rPr>
-                  <m:t>1,84 H</m:t>
+                  <m:t>1,77 H</m:t>
                 </m:r>
               </m:oMath>
             </m:oMathPara>
@@ -4573,6 +4564,9 @@
               </m:oMathParaPr>
               <m:oMath>
                 <m:r>
+                  <m:rPr>
+                    <m:sty m:val="p"/>
+                  </m:rPr>
                   <w:rPr>
                     <w:rFonts w:ascii="Cambria Math" w:hAnsi="Cambria Math"/>
                   </w:rPr>
@@ -4597,19 +4591,13 @@
               </m:oMathParaPr>
               <m:oMath>
                 <m:r>
-                  <w:rPr>
-                    <w:rFonts w:ascii="Cambria Math" w:hAnsi="Cambria Math"/>
-                  </w:rPr>
-                  <m:t>346,4 k</m:t>
-                </m:r>
-                <m:r>
                   <m:rPr>
                     <m:sty m:val="p"/>
                   </m:rPr>
                   <w:rPr>
                     <w:rFonts w:ascii="Cambria Math" w:hAnsi="Cambria Math"/>
                   </w:rPr>
-                  <m:t>Ω</m:t>
+                  <m:t>351,1 kΩ</m:t>
                 </m:r>
               </m:oMath>
             </m:oMathPara>
@@ -4648,37 +4636,13 @@
               </m:oMathParaPr>
               <m:oMath>
                 <m:r>
-                  <w:rPr>
-                    <w:rFonts w:ascii="Cambria Math" w:hAnsi="Cambria Math"/>
-                  </w:rPr>
-                  <m:t>15</m:t>
-                </m:r>
-                <m:r>
-                  <w:rPr>
-                    <w:rFonts w:ascii="Cambria Math" w:hAnsi="Cambria Math"/>
-                  </w:rPr>
-                  <m:t>,</m:t>
-                </m:r>
-                <m:r>
-                  <w:rPr>
-                    <w:rFonts w:ascii="Cambria Math" w:hAnsi="Cambria Math"/>
-                  </w:rPr>
-                  <m:t>1</m:t>
-                </m:r>
-                <m:r>
-                  <w:rPr>
-                    <w:rFonts w:ascii="Cambria Math" w:hAnsi="Cambria Math"/>
-                  </w:rPr>
-                  <m:t xml:space="preserve"> k</m:t>
-                </m:r>
-                <m:r>
                   <m:rPr>
                     <m:sty m:val="p"/>
                   </m:rPr>
                   <w:rPr>
                     <w:rFonts w:ascii="Cambria Math" w:hAnsi="Cambria Math"/>
                   </w:rPr>
-                  <m:t>Ω</m:t>
+                  <m:t>15,1 kΩ</m:t>
                 </m:r>
               </m:oMath>
             </m:oMathPara>
@@ -4693,14 +4657,14 @@
               <w:spacing w:line="360" w:lineRule="auto"/>
               <w:jc w:val="both"/>
               <w:rPr>
-                <w:rFonts w:ascii="Times New Roman" w:eastAsia="SimSun" w:hAnsi="Times New Roman" w:cs="Times New Roman"/>
+                <w:rFonts w:ascii="Cambria Math" w:eastAsia="SimSun" w:hAnsi="Cambria Math" w:cs="Times New Roman"/>
               </w:rPr>
             </w:pPr>
             <w:r>
               <w:rPr>
-                <w:rFonts w:ascii="Times New Roman" w:eastAsia="SimSun" w:hAnsi="Times New Roman" w:cs="Times New Roman"/>
-              </w:rPr>
-              <w:t>?</w:t>
+                <w:rFonts w:ascii="Cambria Math" w:eastAsia="SimSun" w:hAnsi="Cambria Math" w:cs="Times New Roman"/>
+              </w:rPr>
+              <w:t>4,71 H</w:t>
             </w:r>
           </w:p>
         </w:tc>
@@ -4713,14 +4677,14 @@
               <w:spacing w:line="360" w:lineRule="auto"/>
               <w:jc w:val="both"/>
               <w:rPr>
-                <w:rFonts w:ascii="Times New Roman" w:eastAsia="SimSun" w:hAnsi="Times New Roman" w:cs="Times New Roman"/>
+                <w:rFonts w:ascii="Cambria Math" w:eastAsia="SimSun" w:hAnsi="Cambria Math" w:cs="Times New Roman"/>
               </w:rPr>
             </w:pPr>
             <w:r>
               <w:rPr>
-                <w:rFonts w:ascii="Times New Roman" w:eastAsia="SimSun" w:hAnsi="Times New Roman" w:cs="Times New Roman"/>
-              </w:rPr>
-              <w:t>?</w:t>
+                <w:rFonts w:ascii="Cambria Math" w:eastAsia="SimSun" w:hAnsi="Cambria Math" w:cs="Times New Roman"/>
+              </w:rPr>
+              <w:t>110 pF</w:t>
             </w:r>
           </w:p>
         </w:tc>
@@ -4736,12 +4700,31 @@
                 <w:rFonts w:ascii="Times New Roman" w:eastAsia="SimSun" w:hAnsi="Times New Roman" w:cs="Times New Roman"/>
               </w:rPr>
             </w:pPr>
-            <w:r>
-              <w:rPr>
-                <w:rFonts w:ascii="Times New Roman" w:eastAsia="SimSun" w:hAnsi="Times New Roman" w:cs="Times New Roman"/>
-              </w:rPr>
-              <w:t>?</w:t>
-            </w:r>
+            <m:oMathPara>
+              <m:oMathParaPr>
+                <m:jc m:val="left"/>
+              </m:oMathParaPr>
+              <m:oMath>
+                <m:r>
+                  <m:rPr>
+                    <m:sty m:val="p"/>
+                  </m:rPr>
+                  <w:rPr>
+                    <w:rFonts w:ascii="Cambria Math" w:eastAsia="SimSun" w:hAnsi="Cambria Math" w:cs="Times New Roman"/>
+                  </w:rPr>
+                  <m:t>1,07 M</m:t>
+                </m:r>
+                <m:r>
+                  <m:rPr>
+                    <m:sty m:val="p"/>
+                  </m:rPr>
+                  <w:rPr>
+                    <w:rFonts w:ascii="Cambria Math" w:eastAsia="SimSun" w:hAnsi="Cambria Math" w:cs="Times New Roman"/>
+                  </w:rPr>
+                  <m:t>Ω</m:t>
+                </m:r>
+              </m:oMath>
+            </m:oMathPara>
           </w:p>
         </w:tc>
       </w:tr>
@@ -4782,8 +4765,8 @@
           <w:noProof/>
         </w:rPr>
         <w:drawing>
-          <wp:inline distT="0" distB="0" distL="0" distR="0" wp14:anchorId="6DC72DD4" wp14:editId="4A9D5301">
-            <wp:extent cx="2700000" cy="2249999"/>
+          <wp:inline distT="0" distB="0" distL="0" distR="0" wp14:anchorId="6DC72DD4" wp14:editId="393C647D">
+            <wp:extent cx="2699998" cy="2249999"/>
             <wp:effectExtent l="0" t="0" r="5715" b="0"/>
             <wp:docPr id="19738153" name="Picture 3"/>
             <wp:cNvGraphicFramePr>
@@ -4811,7 +4794,7 @@
                   <pic:spPr>
                     <a:xfrm>
                       <a:off x="0" y="0"/>
-                      <a:ext cx="2700000" cy="2249999"/>
+                      <a:ext cx="2699998" cy="2249999"/>
                     </a:xfrm>
                     <a:prstGeom prst="rect">
                       <a:avLst/>
@@ -4824,12 +4807,15 @@
         </w:drawing>
       </w:r>
       <w:r>
+        <w:t xml:space="preserve">      </w:t>
+      </w:r>
+      <w:r>
         <w:rPr>
           <w:noProof/>
         </w:rPr>
         <w:drawing>
-          <wp:inline distT="0" distB="0" distL="0" distR="0" wp14:anchorId="59F4EA54" wp14:editId="22C5384A">
-            <wp:extent cx="2700000" cy="2249999"/>
+          <wp:inline distT="0" distB="0" distL="0" distR="0" wp14:anchorId="59F4EA54" wp14:editId="0B182B28">
+            <wp:extent cx="2699998" cy="2249999"/>
             <wp:effectExtent l="0" t="0" r="5715" b="0"/>
             <wp:docPr id="1083605305" name="Picture 4"/>
             <wp:cNvGraphicFramePr>
@@ -4857,7 +4843,7 @@
                   <pic:spPr>
                     <a:xfrm>
                       <a:off x="0" y="0"/>
-                      <a:ext cx="2700000" cy="2249999"/>
+                      <a:ext cx="2699998" cy="2249999"/>
                     </a:xfrm>
                     <a:prstGeom prst="rect">
                       <a:avLst/>
@@ -4874,6 +4860,7 @@
       <w:pPr>
         <w:pStyle w:val="Caption"/>
         <w:spacing w:line="360" w:lineRule="auto"/>
+        <w:ind w:left="5040" w:hanging="5040"/>
       </w:pPr>
       <w:r>
         <w:t xml:space="preserve">Figure </w:t>
@@ -4901,7 +4888,10 @@
         </w:r>
       </w:fldSimple>
       <w:r>
-        <w:t xml:space="preserve"> : Optimisation numérique</w:t>
+        <w:t xml:space="preserve"> : </w:t>
+      </w:r>
+      <w:r>
+        <w:t>Convergence de l’algorithme de Levenberg – Marquardt</w:t>
       </w:r>
     </w:p>
     <w:p>
@@ -4981,8 +4971,8 @@
           <w:noProof/>
         </w:rPr>
         <w:drawing>
-          <wp:inline distT="0" distB="0" distL="0" distR="0" wp14:anchorId="6F0FA18C" wp14:editId="283F62FC">
-            <wp:extent cx="3600000" cy="2699999"/>
+          <wp:inline distT="0" distB="0" distL="0" distR="0" wp14:anchorId="6F0FA18C" wp14:editId="73A13917">
+            <wp:extent cx="3599998" cy="2699999"/>
             <wp:effectExtent l="0" t="0" r="635" b="5715"/>
             <wp:docPr id="750053161" name="Picture 5"/>
             <wp:cNvGraphicFramePr>
@@ -5010,7 +5000,7 @@
                   <pic:spPr>
                     <a:xfrm>
                       <a:off x="0" y="0"/>
-                      <a:ext cx="3600000" cy="2699999"/>
+                      <a:ext cx="3599998" cy="2699999"/>
                     </a:xfrm>
                     <a:prstGeom prst="rect">
                       <a:avLst/>
@@ -7789,9 +7779,9 @@
           <w:noProof/>
         </w:rPr>
         <w:drawing>
-          <wp:inline distT="0" distB="0" distL="0" distR="0" wp14:anchorId="657BEBB9" wp14:editId="3628F4EB">
-            <wp:extent cx="2473303" cy="3600000"/>
-            <wp:effectExtent l="7937" t="0" r="0" b="0"/>
+          <wp:inline distT="0" distB="0" distL="0" distR="0" wp14:anchorId="657BEBB9" wp14:editId="27B81119">
+            <wp:extent cx="2373480" cy="2393950"/>
+            <wp:effectExtent l="0" t="0" r="8255" b="6350"/>
             <wp:docPr id="1382931371" name="Picture 2"/>
             <wp:cNvGraphicFramePr>
               <a:graphicFrameLocks xmlns:a="http://schemas.openxmlformats.org/drawingml/2006/main" noChangeAspect="1"/>
@@ -7800,10 +7790,10 @@
               <a:graphicData uri="http://schemas.openxmlformats.org/drawingml/2006/picture">
                 <pic:pic xmlns:pic="http://schemas.openxmlformats.org/drawingml/2006/picture">
                   <pic:nvPicPr>
-                    <pic:cNvPr id="1382931371" name="Picture 1382931371"/>
+                    <pic:cNvPr id="1382931371" name="Picture 2"/>
                     <pic:cNvPicPr/>
                   </pic:nvPicPr>
-                  <pic:blipFill rotWithShape="1">
+                  <pic:blipFill>
                     <a:blip r:embed="rId14" cstate="print">
                       <a:extLst>
                         <a:ext uri="{28A0092B-C50C-407E-A947-70E740481C1C}">
@@ -7811,15 +7801,15 @@
                         </a:ext>
                       </a:extLst>
                     </a:blip>
-                    <a:srcRect l="19249" r="29225"/>
+                    <a:srcRect l="15494" r="15494"/>
                     <a:stretch>
                       <a:fillRect/>
                     </a:stretch>
                   </pic:blipFill>
                   <pic:spPr bwMode="auto">
-                    <a:xfrm rot="5400000">
+                    <a:xfrm>
                       <a:off x="0" y="0"/>
-                      <a:ext cx="2473303" cy="3600000"/>
+                      <a:ext cx="2376781" cy="2397279"/>
                     </a:xfrm>
                     <a:prstGeom prst="rect">
                       <a:avLst/>
@@ -7884,17 +7874,17 @@
       <w:pPr>
         <w:spacing w:line="360" w:lineRule="auto"/>
         <w:ind w:firstLine="0"/>
-        <w:jc w:val="both"/>
+        <w:jc w:val="center"/>
       </w:pPr>
       <w:r>
         <w:rPr>
           <w:noProof/>
         </w:rPr>
         <w:drawing>
-          <wp:inline distT="0" distB="0" distL="0" distR="0" wp14:anchorId="5B9505B4" wp14:editId="13E73790">
-            <wp:extent cx="2700000" cy="2249999"/>
-            <wp:effectExtent l="0" t="0" r="5715" b="0"/>
-            <wp:docPr id="940009763" name="Picture 3"/>
+          <wp:inline distT="0" distB="0" distL="0" distR="0" wp14:anchorId="76650DBD" wp14:editId="02762926">
+            <wp:extent cx="1908000" cy="1589999"/>
+            <wp:effectExtent l="0" t="0" r="0" b="0"/>
+            <wp:docPr id="669163942" name="Picture 5"/>
             <wp:cNvGraphicFramePr>
               <a:graphicFrameLocks xmlns:a="http://schemas.openxmlformats.org/drawingml/2006/main" noChangeAspect="1"/>
             </wp:cNvGraphicFramePr>
@@ -7902,7 +7892,7 @@
               <a:graphicData uri="http://schemas.openxmlformats.org/drawingml/2006/picture">
                 <pic:pic xmlns:pic="http://schemas.openxmlformats.org/drawingml/2006/picture">
                   <pic:nvPicPr>
-                    <pic:cNvPr id="940009763" name="Picture 3"/>
+                    <pic:cNvPr id="669163942" name="Picture 5"/>
                     <pic:cNvPicPr/>
                   </pic:nvPicPr>
                   <pic:blipFill>
@@ -7920,7 +7910,7 @@
                   <pic:spPr>
                     <a:xfrm>
                       <a:off x="0" y="0"/>
-                      <a:ext cx="2700000" cy="2249999"/>
+                      <a:ext cx="1908000" cy="1589999"/>
                     </a:xfrm>
                     <a:prstGeom prst="rect">
                       <a:avLst/>
@@ -7937,10 +7927,10 @@
           <w:noProof/>
         </w:rPr>
         <w:drawing>
-          <wp:inline distT="0" distB="0" distL="0" distR="0" wp14:anchorId="3F5C52EA" wp14:editId="5550B2C6">
-            <wp:extent cx="2700000" cy="2249999"/>
-            <wp:effectExtent l="0" t="0" r="5715" b="0"/>
-            <wp:docPr id="878929061" name="Picture 4"/>
+          <wp:inline distT="0" distB="0" distL="0" distR="0" wp14:anchorId="78B4B721" wp14:editId="27EE77C9">
+            <wp:extent cx="1908000" cy="1589999"/>
+            <wp:effectExtent l="0" t="0" r="0" b="0"/>
+            <wp:docPr id="334198297" name="Picture 5"/>
             <wp:cNvGraphicFramePr>
               <a:graphicFrameLocks xmlns:a="http://schemas.openxmlformats.org/drawingml/2006/main" noChangeAspect="1"/>
             </wp:cNvGraphicFramePr>
@@ -7948,7 +7938,7 @@
               <a:graphicData uri="http://schemas.openxmlformats.org/drawingml/2006/picture">
                 <pic:pic xmlns:pic="http://schemas.openxmlformats.org/drawingml/2006/picture">
                   <pic:nvPicPr>
-                    <pic:cNvPr id="878929061" name="Picture 4"/>
+                    <pic:cNvPr id="334198297" name="Picture 5"/>
                     <pic:cNvPicPr/>
                   </pic:nvPicPr>
                   <pic:blipFill>
@@ -7966,7 +7956,7 @@
                   <pic:spPr>
                     <a:xfrm>
                       <a:off x="0" y="0"/>
-                      <a:ext cx="2700000" cy="2249999"/>
+                      <a:ext cx="1908000" cy="1589999"/>
                     </a:xfrm>
                     <a:prstGeom prst="rect">
                       <a:avLst/>
@@ -7978,30 +7968,15 @@
           </wp:inline>
         </w:drawing>
       </w:r>
-    </w:p>
-    <w:p>
-      <w:pPr>
-        <w:pStyle w:val="Caption"/>
-        <w:jc w:val="center"/>
-      </w:pPr>
-      <w:r>
-        <w:t>Figure 7 : Réponse temporelle du micro à une excitation de la corde</w:t>
-      </w:r>
-    </w:p>
-    <w:p>
-      <w:pPr>
-        <w:ind w:firstLine="0"/>
-        <w:jc w:val="center"/>
-      </w:pPr>
       <w:r>
         <w:rPr>
           <w:noProof/>
         </w:rPr>
         <w:drawing>
-          <wp:inline distT="0" distB="0" distL="0" distR="0" wp14:anchorId="6DE221FE" wp14:editId="3E296692">
-            <wp:extent cx="2520000" cy="2099999"/>
+          <wp:inline distT="0" distB="0" distL="0" distR="0" wp14:anchorId="72E8B2AB" wp14:editId="356612DD">
+            <wp:extent cx="1908000" cy="1589999"/>
             <wp:effectExtent l="0" t="0" r="0" b="0"/>
-            <wp:docPr id="880851781" name="Picture 5"/>
+            <wp:docPr id="1506521059" name="Picture 5"/>
             <wp:cNvGraphicFramePr>
               <a:graphicFrameLocks xmlns:a="http://schemas.openxmlformats.org/drawingml/2006/main" noChangeAspect="1"/>
             </wp:cNvGraphicFramePr>
@@ -8009,7 +7984,7 @@
               <a:graphicData uri="http://schemas.openxmlformats.org/drawingml/2006/picture">
                 <pic:pic xmlns:pic="http://schemas.openxmlformats.org/drawingml/2006/picture">
                   <pic:nvPicPr>
-                    <pic:cNvPr id="880851781" name="Picture 5"/>
+                    <pic:cNvPr id="1506521059" name="Picture 5"/>
                     <pic:cNvPicPr/>
                   </pic:nvPicPr>
                   <pic:blipFill>
@@ -8027,7 +8002,7 @@
                   <pic:spPr>
                     <a:xfrm>
                       <a:off x="0" y="0"/>
-                      <a:ext cx="2520000" cy="2099999"/>
+                      <a:ext cx="1908000" cy="1589999"/>
                     </a:xfrm>
                     <a:prstGeom prst="rect">
                       <a:avLst/>
@@ -8039,15 +8014,30 @@
           </wp:inline>
         </w:drawing>
       </w:r>
+    </w:p>
+    <w:p>
+      <w:pPr>
+        <w:pStyle w:val="Caption"/>
+        <w:jc w:val="center"/>
+      </w:pPr>
+      <w:r>
+        <w:t>Figure 7 : Réponse temporelle du micro à une excitation de la corde</w:t>
+      </w:r>
+    </w:p>
+    <w:p>
+      <w:pPr>
+        <w:ind w:firstLine="0"/>
+        <w:jc w:val="center"/>
+      </w:pPr>
       <w:r>
         <w:rPr>
           <w:noProof/>
         </w:rPr>
         <w:drawing>
-          <wp:inline distT="0" distB="0" distL="0" distR="0" wp14:anchorId="5709153F" wp14:editId="04B21056">
-            <wp:extent cx="2700000" cy="2249999"/>
-            <wp:effectExtent l="0" t="0" r="5715" b="0"/>
-            <wp:docPr id="1011573695" name="Picture 6"/>
+          <wp:inline distT="0" distB="0" distL="0" distR="0" wp14:anchorId="6DE221FE" wp14:editId="522375AB">
+            <wp:extent cx="1908000" cy="1590001"/>
+            <wp:effectExtent l="0" t="0" r="0" b="0"/>
+            <wp:docPr id="880851781" name="Picture 5"/>
             <wp:cNvGraphicFramePr>
               <a:graphicFrameLocks xmlns:a="http://schemas.openxmlformats.org/drawingml/2006/main" noChangeAspect="1"/>
             </wp:cNvGraphicFramePr>
@@ -8055,7 +8045,7 @@
               <a:graphicData uri="http://schemas.openxmlformats.org/drawingml/2006/picture">
                 <pic:pic xmlns:pic="http://schemas.openxmlformats.org/drawingml/2006/picture">
                   <pic:nvPicPr>
-                    <pic:cNvPr id="1011573695" name="Picture 6"/>
+                    <pic:cNvPr id="880851781" name="Picture 5"/>
                     <pic:cNvPicPr/>
                   </pic:nvPicPr>
                   <pic:blipFill>
@@ -8073,7 +8063,7 @@
                   <pic:spPr>
                     <a:xfrm>
                       <a:off x="0" y="0"/>
-                      <a:ext cx="2700000" cy="2249999"/>
+                      <a:ext cx="1908000" cy="1590001"/>
                     </a:xfrm>
                     <a:prstGeom prst="rect">
                       <a:avLst/>
@@ -8085,249 +8075,15 @@
           </wp:inline>
         </w:drawing>
       </w:r>
-    </w:p>
-    <w:p>
-      <w:pPr>
-        <w:pStyle w:val="Caption"/>
-        <w:jc w:val="center"/>
-      </w:pPr>
-      <w:r>
-        <w:t>Figure 8 : Réponse spectrale du micro à une excitation de la corde</w:t>
-      </w:r>
-    </w:p>
-    <w:p>
-      <w:pPr>
-        <w:spacing w:line="360" w:lineRule="auto"/>
-        <w:jc w:val="both"/>
-      </w:pPr>
-      <w:r>
-        <w:t xml:space="preserve">Premièrement, l'excitation manuelle de la corde introduit une condition initiale de pincement qui n'est pas parfaitement triangulaire, générant un contenu harmonique plus riche que le modèle idéal en </w:t>
-      </w:r>
-      <m:oMath>
-        <m:f>
-          <m:fPr>
-            <m:ctrlPr>
-              <w:rPr>
-                <w:rFonts w:ascii="Cambria Math" w:hAnsi="Cambria Math"/>
-                <w:i/>
-              </w:rPr>
-            </m:ctrlPr>
-          </m:fPr>
-          <m:num>
-            <m:r>
-              <w:rPr>
-                <w:rFonts w:ascii="Cambria Math" w:hAnsi="Cambria Math"/>
-              </w:rPr>
-              <m:t>1</m:t>
-            </m:r>
-          </m:num>
-          <m:den>
-            <m:r>
-              <w:rPr>
-                <w:rFonts w:ascii="Cambria Math" w:hAnsi="Cambria Math"/>
-              </w:rPr>
-              <m:t>n²</m:t>
-            </m:r>
-          </m:den>
-        </m:f>
-      </m:oMath>
-      <w:r>
-        <w:t xml:space="preserve">. </w:t>
-      </w:r>
-    </w:p>
-    <w:p>
-      <w:pPr>
-        <w:spacing w:line="360" w:lineRule="auto"/>
-        <w:jc w:val="both"/>
-      </w:pPr>
-      <w:r>
-        <w:t>Deuxièmement, l'approximation du micro comme un capteur ponctuel néglige l'intégration du flux sur la largeur réelle de la bobine. En pratique, la surface finie des plots magnétiques agit comme un filtre spatial passe-bas supplémentaire qui atténue les harmoniques dont la longueur d'onde est comparable à la dimension du plot.</w:t>
-      </w:r>
-    </w:p>
-    <w:p>
-      <w:pPr>
-        <w:spacing w:line="360" w:lineRule="auto"/>
-        <w:jc w:val="both"/>
-      </w:pPr>
-      <w:r>
-        <w:t xml:space="preserve">Une autre source de divergence réside dans la non-linéarité du champ magnétique à proximité immédiate des aimants. Le modèle théorique s'appuie sur un gradient de champ </w:t>
-      </w:r>
-      <m:oMath>
-        <m:f>
-          <m:fPr>
-            <m:ctrlPr>
-              <w:rPr>
-                <w:rFonts w:ascii="Cambria Math" w:hAnsi="Cambria Math"/>
-                <w:i/>
-              </w:rPr>
-            </m:ctrlPr>
-          </m:fPr>
-          <m:num>
-            <m:r>
-              <w:rPr>
-                <w:rFonts w:ascii="Cambria Math" w:hAnsi="Cambria Math"/>
-              </w:rPr>
-              <m:t>∂</m:t>
-            </m:r>
-            <m:sSub>
-              <m:sSubPr>
-                <m:ctrlPr>
-                  <w:rPr>
-                    <w:rFonts w:ascii="Cambria Math" w:hAnsi="Cambria Math"/>
-                    <w:i/>
-                  </w:rPr>
-                </m:ctrlPr>
-              </m:sSubPr>
-              <m:e>
-                <m:r>
-                  <w:rPr>
-                    <w:rFonts w:ascii="Cambria Math" w:hAnsi="Cambria Math"/>
-                  </w:rPr>
-                  <m:t>B</m:t>
-                </m:r>
-              </m:e>
-              <m:sub>
-                <m:r>
-                  <w:rPr>
-                    <w:rFonts w:ascii="Cambria Math" w:hAnsi="Cambria Math"/>
-                  </w:rPr>
-                  <m:t>m</m:t>
-                </m:r>
-              </m:sub>
-            </m:sSub>
-          </m:num>
-          <m:den>
-            <m:r>
-              <w:rPr>
-                <w:rFonts w:ascii="Cambria Math" w:hAnsi="Cambria Math"/>
-              </w:rPr>
-              <m:t>∂z</m:t>
-            </m:r>
-          </m:den>
-        </m:f>
-      </m:oMath>
-      <w:r>
-        <w:t xml:space="preserve"> </w:t>
-      </w:r>
-      <w:r>
-        <w:lastRenderedPageBreak/>
-        <w:t xml:space="preserve">considéré comme constant ou suivant une loi en </w:t>
-      </w:r>
-      <m:oMath>
-        <m:f>
-          <m:fPr>
-            <m:ctrlPr>
-              <w:rPr>
-                <w:rFonts w:ascii="Cambria Math" w:hAnsi="Cambria Math"/>
-                <w:i/>
-              </w:rPr>
-            </m:ctrlPr>
-          </m:fPr>
-          <m:num>
-            <m:r>
-              <w:rPr>
-                <w:rFonts w:ascii="Cambria Math" w:hAnsi="Cambria Math"/>
-              </w:rPr>
-              <m:t>1</m:t>
-            </m:r>
-          </m:num>
-          <m:den>
-            <m:sSup>
-              <m:sSupPr>
-                <m:ctrlPr>
-                  <w:rPr>
-                    <w:rFonts w:ascii="Cambria Math" w:hAnsi="Cambria Math"/>
-                    <w:i/>
-                  </w:rPr>
-                </m:ctrlPr>
-              </m:sSupPr>
-              <m:e>
-                <m:r>
-                  <w:rPr>
-                    <w:rFonts w:ascii="Cambria Math" w:hAnsi="Cambria Math"/>
-                  </w:rPr>
-                  <m:t>z</m:t>
-                </m:r>
-              </m:e>
-              <m:sup>
-                <m:r>
-                  <w:rPr>
-                    <w:rFonts w:ascii="Cambria Math" w:hAnsi="Cambria Math"/>
-                  </w:rPr>
-                  <m:t>4</m:t>
-                </m:r>
-              </m:sup>
-            </m:sSup>
-          </m:den>
-        </m:f>
-      </m:oMath>
-      <w:r>
-        <w:t xml:space="preserve"> simplifiée. Or, lorsque l'amplitude de vibration de la corde est importante, celle-ci s'approche des zones de forte saturation magnétique du plot, ce qui provoque une distorsion du signal temporel. Ce phénomène explique l'allure plus « pointue » et agressive des pics de tension observés à l'oscilloscope par rapport à la courbure plus douce des simulations théoriques</w:t>
-      </w:r>
-    </w:p>
-    <w:p>
-      <w:pPr>
-        <w:spacing w:line="360" w:lineRule="auto"/>
-        <w:jc w:val="both"/>
-      </w:pPr>
-    </w:p>
-    <w:p>
-      <w:pPr>
-        <w:pStyle w:val="Heading2"/>
-        <w:spacing w:line="360" w:lineRule="auto"/>
-      </w:pPr>
-      <w:bookmarkStart w:id="9" w:name="_Toc221535306"/>
-      <w:r>
-        <w:t>II.III. Conclusion</w:t>
-      </w:r>
-      <w:bookmarkEnd w:id="9"/>
-    </w:p>
-    <w:p>
-      <w:pPr>
-        <w:spacing w:line="360" w:lineRule="auto"/>
-        <w:jc w:val="both"/>
-      </w:pPr>
-      <w:r>
-        <w:t xml:space="preserve">L'étude comparative des deux technologies souligne l'influence déterminante de la géométrie du bobinage sur le timbre de l'instrument. Le micro SingleCoil, par sa capture ponctuelle, préserve une grande partie du spectre harmonique, conférant au son </w:t>
-      </w:r>
-      <w:proofErr w:type="spellStart"/>
-      <w:r>
-        <w:t>sa</w:t>
-      </w:r>
-      <w:proofErr w:type="spellEnd"/>
-      <w:r>
-        <w:t xml:space="preserve"> brillance caractéristique. À l'inverse, le Humbucker induit un phénomène de filtrage en peigne spatial inhérent à sa structure double. En sommant les signaux de deux bobines espacées d'une distance </w:t>
-      </w:r>
-      <m:oMath>
-        <m:r>
-          <m:rPr>
-            <m:sty m:val="p"/>
-          </m:rPr>
-          <w:rPr>
-            <w:rFonts w:ascii="Cambria Math" w:hAnsi="Cambria Math"/>
-          </w:rPr>
-          <m:t>Δ</m:t>
-        </m:r>
-      </m:oMath>
-      <w:r>
-        <w:t>, le dispositif crée des interférences destructives pour certaines longueurs d'onde vibratoires.</w:t>
-      </w:r>
-    </w:p>
-    <w:p>
-      <w:pPr>
-        <w:spacing w:line="360" w:lineRule="auto"/>
-        <w:ind w:firstLine="0"/>
-        <w:jc w:val="center"/>
-      </w:pPr>
       <w:r>
         <w:rPr>
           <w:noProof/>
         </w:rPr>
         <w:drawing>
-          <wp:inline distT="0" distB="0" distL="0" distR="0" wp14:anchorId="198B490E" wp14:editId="2C6DA079">
-            <wp:extent cx="3888000" cy="3239999"/>
+          <wp:inline distT="0" distB="0" distL="0" distR="0" wp14:anchorId="5709153F" wp14:editId="389BF56F">
+            <wp:extent cx="1908000" cy="1590001"/>
             <wp:effectExtent l="0" t="0" r="0" b="0"/>
-            <wp:docPr id="1904316813" name="Picture 7"/>
+            <wp:docPr id="1011573695" name="Picture 6"/>
             <wp:cNvGraphicFramePr>
               <a:graphicFrameLocks xmlns:a="http://schemas.openxmlformats.org/drawingml/2006/main" noChangeAspect="1"/>
             </wp:cNvGraphicFramePr>
@@ -8335,7 +8091,7 @@
               <a:graphicData uri="http://schemas.openxmlformats.org/drawingml/2006/picture">
                 <pic:pic xmlns:pic="http://schemas.openxmlformats.org/drawingml/2006/picture">
                   <pic:nvPicPr>
-                    <pic:cNvPr id="1904316813" name="Picture 7"/>
+                    <pic:cNvPr id="1011573695" name="Picture 6"/>
                     <pic:cNvPicPr/>
                   </pic:nvPicPr>
                   <pic:blipFill>
@@ -8353,7 +8109,7 @@
                   <pic:spPr>
                     <a:xfrm>
                       <a:off x="0" y="0"/>
-                      <a:ext cx="3888000" cy="3239999"/>
+                      <a:ext cx="1908000" cy="1590001"/>
                     </a:xfrm>
                     <a:prstGeom prst="rect">
                       <a:avLst/>
@@ -8365,6 +8121,52 @@
           </wp:inline>
         </w:drawing>
       </w:r>
+      <w:r>
+        <w:rPr>
+          <w:noProof/>
+        </w:rPr>
+        <w:drawing>
+          <wp:inline distT="0" distB="0" distL="0" distR="0" wp14:anchorId="7CC40BA2" wp14:editId="76AF27EF">
+            <wp:extent cx="1908000" cy="1589999"/>
+            <wp:effectExtent l="0" t="0" r="0" b="0"/>
+            <wp:docPr id="913371348" name="Picture 6"/>
+            <wp:cNvGraphicFramePr>
+              <a:graphicFrameLocks xmlns:a="http://schemas.openxmlformats.org/drawingml/2006/main" noChangeAspect="1"/>
+            </wp:cNvGraphicFramePr>
+            <a:graphic xmlns:a="http://schemas.openxmlformats.org/drawingml/2006/main">
+              <a:graphicData uri="http://schemas.openxmlformats.org/drawingml/2006/picture">
+                <pic:pic xmlns:pic="http://schemas.openxmlformats.org/drawingml/2006/picture">
+                  <pic:nvPicPr>
+                    <pic:cNvPr id="913371348" name="Picture 6"/>
+                    <pic:cNvPicPr/>
+                  </pic:nvPicPr>
+                  <pic:blipFill>
+                    <a:blip r:embed="rId20" cstate="print">
+                      <a:extLst>
+                        <a:ext uri="{28A0092B-C50C-407E-A947-70E740481C1C}">
+                          <a14:useLocalDpi xmlns:a14="http://schemas.microsoft.com/office/drawing/2010/main" val="0"/>
+                        </a:ext>
+                      </a:extLst>
+                    </a:blip>
+                    <a:stretch>
+                      <a:fillRect/>
+                    </a:stretch>
+                  </pic:blipFill>
+                  <pic:spPr>
+                    <a:xfrm>
+                      <a:off x="0" y="0"/>
+                      <a:ext cx="1908000" cy="1589999"/>
+                    </a:xfrm>
+                    <a:prstGeom prst="rect">
+                      <a:avLst/>
+                    </a:prstGeom>
+                  </pic:spPr>
+                </pic:pic>
+              </a:graphicData>
+            </a:graphic>
+          </wp:inline>
+        </w:drawing>
+      </w:r>
     </w:p>
     <w:p>
       <w:pPr>
@@ -8372,7 +8174,7 @@
         <w:jc w:val="center"/>
       </w:pPr>
       <w:r>
-        <w:t>Figure 9 : Filtrage en peigne spatial du micro Humbucker</w:t>
+        <w:t>Figure 8 : Réponse spectrale du micro à une excitation de la corde</w:t>
       </w:r>
     </w:p>
     <w:p>
@@ -8381,8 +8183,306 @@
         <w:jc w:val="both"/>
       </w:pPr>
       <w:r>
+        <w:t xml:space="preserve">Premièrement, l'excitation manuelle de la corde introduit une condition initiale de pincement qui n'est pas parfaitement triangulaire, générant un contenu harmonique plus riche que le modèle idéal en </w:t>
+      </w:r>
+      <m:oMath>
+        <m:f>
+          <m:fPr>
+            <m:ctrlPr>
+              <w:rPr>
+                <w:rFonts w:ascii="Cambria Math" w:hAnsi="Cambria Math"/>
+                <w:i/>
+              </w:rPr>
+            </m:ctrlPr>
+          </m:fPr>
+          <m:num>
+            <m:r>
+              <w:rPr>
+                <w:rFonts w:ascii="Cambria Math" w:hAnsi="Cambria Math"/>
+              </w:rPr>
+              <m:t>1</m:t>
+            </m:r>
+          </m:num>
+          <m:den>
+            <m:r>
+              <w:rPr>
+                <w:rFonts w:ascii="Cambria Math" w:hAnsi="Cambria Math"/>
+              </w:rPr>
+              <m:t>n²</m:t>
+            </m:r>
+          </m:den>
+        </m:f>
+      </m:oMath>
+      <w:r>
+        <w:t xml:space="preserve">. </w:t>
+      </w:r>
+    </w:p>
+    <w:p>
+      <w:pPr>
+        <w:spacing w:line="360" w:lineRule="auto"/>
+        <w:jc w:val="both"/>
+      </w:pPr>
+      <w:r>
+        <w:t>Deuxièmement, l'approximation du micro comme un capteur ponctuel néglige l'intégration du flux sur la largeur réelle de la bobine. En pratique, la surface finie des plots magnétiques agit comme un filtre spatial passe-bas supplémentaire qui atténue les harmoniques dont la longueur d'onde est comparable à la dimension du plot.</w:t>
+      </w:r>
+    </w:p>
+    <w:p>
+      <w:pPr>
+        <w:spacing w:line="360" w:lineRule="auto"/>
+        <w:jc w:val="both"/>
+      </w:pPr>
+      <w:r>
+        <w:t xml:space="preserve">Une autre source de divergence réside dans la non-linéarité du champ magnétique à proximité immédiate des aimants. Le modèle théorique s'appuie sur un gradient de champ </w:t>
+      </w:r>
+      <m:oMath>
+        <m:f>
+          <m:fPr>
+            <m:ctrlPr>
+              <w:rPr>
+                <w:rFonts w:ascii="Cambria Math" w:hAnsi="Cambria Math"/>
+                <w:i/>
+              </w:rPr>
+            </m:ctrlPr>
+          </m:fPr>
+          <m:num>
+            <m:r>
+              <w:rPr>
+                <w:rFonts w:ascii="Cambria Math" w:hAnsi="Cambria Math"/>
+              </w:rPr>
+              <m:t>∂</m:t>
+            </m:r>
+            <m:sSub>
+              <m:sSubPr>
+                <m:ctrlPr>
+                  <w:rPr>
+                    <w:rFonts w:ascii="Cambria Math" w:hAnsi="Cambria Math"/>
+                    <w:i/>
+                  </w:rPr>
+                </m:ctrlPr>
+              </m:sSubPr>
+              <m:e>
+                <m:r>
+                  <w:rPr>
+                    <w:rFonts w:ascii="Cambria Math" w:hAnsi="Cambria Math"/>
+                  </w:rPr>
+                  <m:t>B</m:t>
+                </m:r>
+              </m:e>
+              <m:sub>
+                <m:r>
+                  <w:rPr>
+                    <w:rFonts w:ascii="Cambria Math" w:hAnsi="Cambria Math"/>
+                  </w:rPr>
+                  <m:t>m</m:t>
+                </m:r>
+              </m:sub>
+            </m:sSub>
+          </m:num>
+          <m:den>
+            <m:r>
+              <w:rPr>
+                <w:rFonts w:ascii="Cambria Math" w:hAnsi="Cambria Math"/>
+              </w:rPr>
+              <m:t>∂z</m:t>
+            </m:r>
+          </m:den>
+        </m:f>
+      </m:oMath>
+      <w:r>
+        <w:t xml:space="preserve"> considéré comme constant ou suivant une loi en </w:t>
+      </w:r>
+      <m:oMath>
+        <m:f>
+          <m:fPr>
+            <m:ctrlPr>
+              <w:rPr>
+                <w:rFonts w:ascii="Cambria Math" w:hAnsi="Cambria Math"/>
+                <w:i/>
+              </w:rPr>
+            </m:ctrlPr>
+          </m:fPr>
+          <m:num>
+            <m:r>
+              <w:rPr>
+                <w:rFonts w:ascii="Cambria Math" w:hAnsi="Cambria Math"/>
+              </w:rPr>
+              <m:t>1</m:t>
+            </m:r>
+          </m:num>
+          <m:den>
+            <m:sSup>
+              <m:sSupPr>
+                <m:ctrlPr>
+                  <w:rPr>
+                    <w:rFonts w:ascii="Cambria Math" w:hAnsi="Cambria Math"/>
+                    <w:i/>
+                  </w:rPr>
+                </m:ctrlPr>
+              </m:sSupPr>
+              <m:e>
+                <m:r>
+                  <w:rPr>
+                    <w:rFonts w:ascii="Cambria Math" w:hAnsi="Cambria Math"/>
+                  </w:rPr>
+                  <m:t>z</m:t>
+                </m:r>
+              </m:e>
+              <m:sup>
+                <m:r>
+                  <w:rPr>
+                    <w:rFonts w:ascii="Cambria Math" w:hAnsi="Cambria Math"/>
+                  </w:rPr>
+                  <m:t>4</m:t>
+                </m:r>
+              </m:sup>
+            </m:sSup>
+          </m:den>
+        </m:f>
+      </m:oMath>
+      <w:r>
+        <w:t xml:space="preserve"> simplifiée. Or, lorsque l'amplitude de vibration de la corde est importante, celle-ci s'approche des zones de forte saturation magnétique du plot, ce qui provoque une distorsion du signal temporel. Ce phénomène explique </w:t>
+      </w:r>
+      <w:r>
+        <w:lastRenderedPageBreak/>
+        <w:t>l'allure plus « pointue » et agressive des pics de tension observés à l'oscilloscope par rapport à la courbure plus douce des simulations théoriques</w:t>
+      </w:r>
+    </w:p>
+    <w:p>
+      <w:pPr>
+        <w:spacing w:line="360" w:lineRule="auto"/>
+        <w:jc w:val="both"/>
+      </w:pPr>
+    </w:p>
+    <w:p>
+      <w:pPr>
+        <w:pStyle w:val="Heading2"/>
+        <w:spacing w:line="360" w:lineRule="auto"/>
+      </w:pPr>
+      <w:bookmarkStart w:id="9" w:name="_Toc221535306"/>
+      <w:r>
+        <w:t>II.III. Conclusion</w:t>
+      </w:r>
+      <w:bookmarkEnd w:id="9"/>
+    </w:p>
+    <w:p>
+      <w:pPr>
+        <w:spacing w:line="360" w:lineRule="auto"/>
+        <w:jc w:val="both"/>
+      </w:pPr>
+      <w:r>
+        <w:t xml:space="preserve">L'étude comparative des deux technologies souligne l'influence déterminante de la géométrie du bobinage sur le timbre de l'instrument. Le micro SingleCoil, par sa capture ponctuelle, préserve une grande partie du spectre harmonique, conférant au son </w:t>
+      </w:r>
+      <w:proofErr w:type="spellStart"/>
+      <w:r>
+        <w:t>sa</w:t>
+      </w:r>
+      <w:proofErr w:type="spellEnd"/>
+      <w:r>
+        <w:t xml:space="preserve"> brillance caractéristique. À l'inverse, le Humbucker induit un phénomène de filtrage en peigne spatial inhérent à sa structure double. En sommant les signaux de deux bobines espacées d'une distance </w:t>
+      </w:r>
+      <m:oMath>
+        <m:r>
+          <m:rPr>
+            <m:sty m:val="p"/>
+          </m:rPr>
+          <w:rPr>
+            <w:rFonts w:ascii="Cambria Math" w:hAnsi="Cambria Math"/>
+          </w:rPr>
+          <m:t>Δ</m:t>
+        </m:r>
+      </m:oMath>
+      <w:r>
+        <w:t>, le dispositif crée des interférences destructives pour certaines longueurs d'onde vibratoires.</w:t>
+      </w:r>
+    </w:p>
+    <w:p>
+      <w:pPr>
+        <w:spacing w:line="360" w:lineRule="auto"/>
+        <w:ind w:firstLine="0"/>
+        <w:jc w:val="center"/>
+      </w:pPr>
+      <w:r>
+        <w:rPr>
+          <w:noProof/>
+        </w:rPr>
+        <w:drawing>
+          <wp:inline distT="0" distB="0" distL="0" distR="0" wp14:anchorId="198B490E" wp14:editId="76722EEC">
+            <wp:extent cx="3887998" cy="3239999"/>
+            <wp:effectExtent l="0" t="0" r="0" b="0"/>
+            <wp:docPr id="1904316813" name="Picture 7"/>
+            <wp:cNvGraphicFramePr>
+              <a:graphicFrameLocks xmlns:a="http://schemas.openxmlformats.org/drawingml/2006/main" noChangeAspect="1"/>
+            </wp:cNvGraphicFramePr>
+            <a:graphic xmlns:a="http://schemas.openxmlformats.org/drawingml/2006/main">
+              <a:graphicData uri="http://schemas.openxmlformats.org/drawingml/2006/picture">
+                <pic:pic xmlns:pic="http://schemas.openxmlformats.org/drawingml/2006/picture">
+                  <pic:nvPicPr>
+                    <pic:cNvPr id="1904316813" name="Picture 7"/>
+                    <pic:cNvPicPr/>
+                  </pic:nvPicPr>
+                  <pic:blipFill>
+                    <a:blip r:embed="rId21" cstate="print">
+                      <a:extLst>
+                        <a:ext uri="{28A0092B-C50C-407E-A947-70E740481C1C}">
+                          <a14:useLocalDpi xmlns:a14="http://schemas.microsoft.com/office/drawing/2010/main" val="0"/>
+                        </a:ext>
+                      </a:extLst>
+                    </a:blip>
+                    <a:stretch>
+                      <a:fillRect/>
+                    </a:stretch>
+                  </pic:blipFill>
+                  <pic:spPr>
+                    <a:xfrm>
+                      <a:off x="0" y="0"/>
+                      <a:ext cx="3887998" cy="3239999"/>
+                    </a:xfrm>
+                    <a:prstGeom prst="rect">
+                      <a:avLst/>
+                    </a:prstGeom>
+                  </pic:spPr>
+                </pic:pic>
+              </a:graphicData>
+            </a:graphic>
+          </wp:inline>
+        </w:drawing>
+      </w:r>
+    </w:p>
+    <w:p>
+      <w:pPr>
+        <w:pStyle w:val="Caption"/>
+        <w:jc w:val="center"/>
+      </w:pPr>
+      <w:r>
+        <w:t>Figure 9 : Filtrage en peigne spatial du micro Humbucker</w:t>
+      </w:r>
+    </w:p>
+    <w:p>
+      <w:pPr>
+        <w:spacing w:line="360" w:lineRule="auto"/>
+        <w:jc w:val="both"/>
+      </w:pPr>
+      <w:r>
         <w:t>Ce filtrage spatial agit comme un égaliseur passif qui atténue spécifiquement les fréquences dont les ventres de vibration se situent en opposition de phase entre les deux bobines. Ce résultat, couplé au filtrage électrique identifié en première partie, explique scientifiquement la sonorité plus « mate » et « ronde » du Humbucker. Ainsi, la double bobine ne se contente pas de traiter le bruit parasite ; elle sculpte activement l'identité acoustique de la guitare en modifiant la structure même du signal induit.</w:t>
       </w:r>
+    </w:p>
+    <w:p>
+      <w:pPr>
+        <w:spacing w:line="360" w:lineRule="auto"/>
+        <w:jc w:val="both"/>
+      </w:pPr>
+    </w:p>
+    <w:p>
+      <w:pPr>
+        <w:spacing w:line="360" w:lineRule="auto"/>
+        <w:jc w:val="both"/>
+      </w:pPr>
+    </w:p>
+    <w:p>
+      <w:pPr>
+        <w:spacing w:line="360" w:lineRule="auto"/>
+        <w:jc w:val="both"/>
+      </w:pPr>
     </w:p>
     <w:p>
       <w:pPr>
@@ -9842,7 +9942,7 @@
                     <pic:cNvPicPr/>
                   </pic:nvPicPr>
                   <pic:blipFill>
-                    <a:blip r:embed="rId20" cstate="print">
+                    <a:blip r:embed="rId22" cstate="print">
                       <a:extLst>
                         <a:ext uri="{28A0092B-C50C-407E-A947-70E740481C1C}">
                           <a14:useLocalDpi xmlns:a14="http://schemas.microsoft.com/office/drawing/2010/main" val="0"/>
@@ -9975,22 +10075,41 @@
         <w:jc w:val="both"/>
       </w:pPr>
       <w:r>
+        <w:t xml:space="preserve">Les mesures effectuées sous un champ parasite d’amplitude variable à une fréquence de </w:t>
+      </w:r>
+      <m:oMath>
+        <m:r>
+          <w:rPr>
+            <w:rFonts w:ascii="Cambria Math" w:hAnsi="Cambria Math"/>
+          </w:rPr>
+          <m:t>50 Hz</m:t>
+        </m:r>
+      </m:oMath>
+      <w:r>
+        <w:t xml:space="preserve"> révèlent une disparité majeure entre les deux technologies (figure </w:t>
+      </w:r>
+      <w:r>
+        <w:t>11</w:t>
+      </w:r>
+      <w:r>
+        <w:t xml:space="preserve">). </w:t>
+      </w:r>
+    </w:p>
+    <w:p>
+      <w:pPr>
+        <w:spacing w:line="360" w:lineRule="auto"/>
+        <w:ind w:firstLine="0"/>
+        <w:jc w:val="both"/>
+      </w:pPr>
+      <w:r>
         <w:rPr>
           <w:noProof/>
         </w:rPr>
         <w:drawing>
-          <wp:anchor distT="0" distB="0" distL="114300" distR="114300" simplePos="0" relativeHeight="251658240" behindDoc="0" locked="0" layoutInCell="1" allowOverlap="1" wp14:anchorId="5C2B73E0" wp14:editId="48D84C9D">
-            <wp:simplePos x="0" y="0"/>
-            <wp:positionH relativeFrom="margin">
-              <wp:posOffset>3026410</wp:posOffset>
-            </wp:positionH>
-            <wp:positionV relativeFrom="paragraph">
-              <wp:posOffset>786765</wp:posOffset>
-            </wp:positionV>
-            <wp:extent cx="2700000" cy="2250000"/>
-            <wp:effectExtent l="0" t="0" r="5715" b="0"/>
-            <wp:wrapTopAndBottom/>
-            <wp:docPr id="2100862549" name="Picture 3"/>
+          <wp:inline distT="0" distB="0" distL="0" distR="0" wp14:anchorId="09896829" wp14:editId="40902F45">
+            <wp:extent cx="1908000" cy="1589999"/>
+            <wp:effectExtent l="0" t="0" r="0" b="0"/>
+            <wp:docPr id="472058884" name="Picture 5"/>
             <wp:cNvGraphicFramePr>
               <a:graphicFrameLocks xmlns:a="http://schemas.openxmlformats.org/drawingml/2006/main" noChangeAspect="1"/>
             </wp:cNvGraphicFramePr>
@@ -9998,358 +10117,7 @@
               <a:graphicData uri="http://schemas.openxmlformats.org/drawingml/2006/picture">
                 <pic:pic xmlns:pic="http://schemas.openxmlformats.org/drawingml/2006/picture">
                   <pic:nvPicPr>
-                    <pic:cNvPr id="2100862549" name="Picture 2100862549"/>
-                    <pic:cNvPicPr/>
-                  </pic:nvPicPr>
-                  <pic:blipFill>
-                    <a:blip r:embed="rId21" cstate="print">
-                      <a:extLst>
-                        <a:ext uri="{28A0092B-C50C-407E-A947-70E740481C1C}">
-                          <a14:useLocalDpi xmlns:a14="http://schemas.microsoft.com/office/drawing/2010/main" val="0"/>
-                        </a:ext>
-                      </a:extLst>
-                    </a:blip>
-                    <a:stretch>
-                      <a:fillRect/>
-                    </a:stretch>
-                  </pic:blipFill>
-                  <pic:spPr>
-                    <a:xfrm>
-                      <a:off x="0" y="0"/>
-                      <a:ext cx="2700000" cy="2250000"/>
-                    </a:xfrm>
-                    <a:prstGeom prst="rect">
-                      <a:avLst/>
-                    </a:prstGeom>
-                  </pic:spPr>
-                </pic:pic>
-              </a:graphicData>
-            </a:graphic>
-            <wp14:sizeRelH relativeFrom="margin">
-              <wp14:pctWidth>0</wp14:pctWidth>
-            </wp14:sizeRelH>
-            <wp14:sizeRelV relativeFrom="margin">
-              <wp14:pctHeight>0</wp14:pctHeight>
-            </wp14:sizeRelV>
-          </wp:anchor>
-        </w:drawing>
-      </w:r>
-      <w:r>
-        <w:rPr>
-          <w:noProof/>
-        </w:rPr>
-        <w:drawing>
-          <wp:anchor distT="0" distB="0" distL="114300" distR="114300" simplePos="0" relativeHeight="251659264" behindDoc="0" locked="0" layoutInCell="1" allowOverlap="1" wp14:anchorId="36566EA4" wp14:editId="75473C11">
-            <wp:simplePos x="0" y="0"/>
-            <wp:positionH relativeFrom="margin">
-              <wp:align>left</wp:align>
-            </wp:positionH>
-            <wp:positionV relativeFrom="paragraph">
-              <wp:posOffset>786765</wp:posOffset>
-            </wp:positionV>
-            <wp:extent cx="2700000" cy="2249651"/>
-            <wp:effectExtent l="0" t="0" r="5715" b="0"/>
-            <wp:wrapTopAndBottom/>
-            <wp:docPr id="762831484" name="Picture 4"/>
-            <wp:cNvGraphicFramePr>
-              <a:graphicFrameLocks xmlns:a="http://schemas.openxmlformats.org/drawingml/2006/main" noChangeAspect="1"/>
-            </wp:cNvGraphicFramePr>
-            <a:graphic xmlns:a="http://schemas.openxmlformats.org/drawingml/2006/main">
-              <a:graphicData uri="http://schemas.openxmlformats.org/drawingml/2006/picture">
-                <pic:pic xmlns:pic="http://schemas.openxmlformats.org/drawingml/2006/picture">
-                  <pic:nvPicPr>
-                    <pic:cNvPr id="762831484" name="Picture 762831484"/>
-                    <pic:cNvPicPr/>
-                  </pic:nvPicPr>
-                  <pic:blipFill>
-                    <a:blip r:embed="rId22" cstate="print">
-                      <a:extLst>
-                        <a:ext uri="{28A0092B-C50C-407E-A947-70E740481C1C}">
-                          <a14:useLocalDpi xmlns:a14="http://schemas.microsoft.com/office/drawing/2010/main" val="0"/>
-                        </a:ext>
-                      </a:extLst>
-                    </a:blip>
-                    <a:stretch>
-                      <a:fillRect/>
-                    </a:stretch>
-                  </pic:blipFill>
-                  <pic:spPr>
-                    <a:xfrm>
-                      <a:off x="0" y="0"/>
-                      <a:ext cx="2700000" cy="2249651"/>
-                    </a:xfrm>
-                    <a:prstGeom prst="rect">
-                      <a:avLst/>
-                    </a:prstGeom>
-                  </pic:spPr>
-                </pic:pic>
-              </a:graphicData>
-            </a:graphic>
-            <wp14:sizeRelH relativeFrom="margin">
-              <wp14:pctWidth>0</wp14:pctWidth>
-            </wp14:sizeRelH>
-            <wp14:sizeRelV relativeFrom="margin">
-              <wp14:pctHeight>0</wp14:pctHeight>
-            </wp14:sizeRelV>
-          </wp:anchor>
-        </w:drawing>
-      </w:r>
-      <w:r>
-        <w:t xml:space="preserve">Les mesures effectuées sous un champ parasite d’amplitude variable à une fréquence de </w:t>
-      </w:r>
-      <m:oMath>
-        <m:r>
-          <w:rPr>
-            <w:rFonts w:ascii="Cambria Math" w:hAnsi="Cambria Math"/>
-          </w:rPr>
-          <m:t>50 Hz</m:t>
-        </m:r>
-      </m:oMath>
-      <w:r>
-        <w:t xml:space="preserve"> révèlent une disparité majeure entre les deux technologies (figure </w:t>
-      </w:r>
-      <w:r>
-        <w:t>11</w:t>
-      </w:r>
-      <w:r>
-        <w:t xml:space="preserve">). </w:t>
-      </w:r>
-    </w:p>
-    <w:p>
-      <w:pPr>
-        <w:spacing w:line="360" w:lineRule="auto"/>
-        <w:ind w:firstLine="0"/>
-        <w:jc w:val="both"/>
-      </w:pPr>
-    </w:p>
-    <w:p>
-      <w:pPr>
-        <w:pStyle w:val="Caption"/>
-        <w:jc w:val="center"/>
-      </w:pPr>
-      <w:r>
-        <w:t>Figure 11 : Réponse temporelle du micro à un champ magnétique extérieur</w:t>
-      </w:r>
-    </w:p>
-    <w:p/>
-    <w:p>
-      <w:pPr>
-        <w:pStyle w:val="Heading3"/>
-        <w:spacing w:line="360" w:lineRule="auto"/>
-        <w:jc w:val="both"/>
-      </w:pPr>
-      <w:r>
-        <w:t>III.II.III. Taux de rejection de mode commun (CMRR)</w:t>
-      </w:r>
-    </w:p>
-    <w:p>
-      <w:pPr>
-        <w:spacing w:line="360" w:lineRule="auto"/>
-        <w:jc w:val="both"/>
-      </w:pPr>
-      <w:r>
-        <w:t xml:space="preserve">Le micro SingleCoil affiche une sensibilité expérimentale </w:t>
-      </w:r>
-      <m:oMath>
-        <m:sSub>
-          <m:sSubPr>
-            <m:ctrlPr>
-              <w:rPr>
-                <w:rFonts w:ascii="Cambria Math" w:hAnsi="Cambria Math"/>
-                <w:i/>
-              </w:rPr>
-            </m:ctrlPr>
-          </m:sSubPr>
-          <m:e>
-            <m:r>
-              <w:rPr>
-                <w:rFonts w:ascii="Cambria Math" w:hAnsi="Cambria Math"/>
-              </w:rPr>
-              <m:t>k</m:t>
-            </m:r>
-          </m:e>
-          <m:sub>
-            <m:r>
-              <w:rPr>
-                <w:rFonts w:ascii="Cambria Math" w:hAnsi="Cambria Math"/>
-              </w:rPr>
-              <m:t>Sexp</m:t>
-            </m:r>
-          </m:sub>
-        </m:sSub>
-        <m:r>
-          <w:rPr>
-            <w:rFonts w:ascii="Cambria Math" w:hAnsi="Cambria Math"/>
-          </w:rPr>
-          <m:t>=1,48 mV.μ</m:t>
-        </m:r>
-        <m:sSup>
-          <m:sSupPr>
-            <m:ctrlPr>
-              <w:rPr>
-                <w:rFonts w:ascii="Cambria Math" w:hAnsi="Cambria Math"/>
-                <w:i/>
-              </w:rPr>
-            </m:ctrlPr>
-          </m:sSupPr>
-          <m:e>
-            <m:r>
-              <w:rPr>
-                <w:rFonts w:ascii="Cambria Math" w:hAnsi="Cambria Math"/>
-              </w:rPr>
-              <m:t>T</m:t>
-            </m:r>
-          </m:e>
-          <m:sup>
-            <m:r>
-              <w:rPr>
-                <w:rFonts w:ascii="Cambria Math" w:hAnsi="Cambria Math"/>
-              </w:rPr>
-              <m:t>-1</m:t>
-            </m:r>
-          </m:sup>
-        </m:sSup>
-      </m:oMath>
-      <w:r>
-        <w:t xml:space="preserve">, tandis que le micro Humbucker présente une sensibilité </w:t>
-      </w:r>
-      <m:oMath>
-        <m:sSub>
-          <m:sSubPr>
-            <m:ctrlPr>
-              <w:rPr>
-                <w:rFonts w:ascii="Cambria Math" w:hAnsi="Cambria Math"/>
-                <w:i/>
-              </w:rPr>
-            </m:ctrlPr>
-          </m:sSubPr>
-          <m:e>
-            <m:r>
-              <w:rPr>
-                <w:rFonts w:ascii="Cambria Math" w:hAnsi="Cambria Math"/>
-              </w:rPr>
-              <m:t>k</m:t>
-            </m:r>
-          </m:e>
-          <m:sub>
-            <m:r>
-              <w:rPr>
-                <w:rFonts w:ascii="Cambria Math" w:hAnsi="Cambria Math"/>
-              </w:rPr>
-              <m:t>Hpexp</m:t>
-            </m:r>
-          </m:sub>
-        </m:sSub>
-        <m:r>
-          <w:rPr>
-            <w:rFonts w:ascii="Cambria Math" w:hAnsi="Cambria Math"/>
-          </w:rPr>
-          <m:t>=0,62 mV.μ</m:t>
-        </m:r>
-        <m:sSup>
-          <m:sSupPr>
-            <m:ctrlPr>
-              <w:rPr>
-                <w:rFonts w:ascii="Cambria Math" w:hAnsi="Cambria Math"/>
-                <w:i/>
-              </w:rPr>
-            </m:ctrlPr>
-          </m:sSupPr>
-          <m:e>
-            <m:r>
-              <w:rPr>
-                <w:rFonts w:ascii="Cambria Math" w:hAnsi="Cambria Math"/>
-              </w:rPr>
-              <m:t>T</m:t>
-            </m:r>
-          </m:e>
-          <m:sup>
-            <m:r>
-              <w:rPr>
-                <w:rFonts w:ascii="Cambria Math" w:hAnsi="Cambria Math"/>
-              </w:rPr>
-              <m:t>-1</m:t>
-            </m:r>
-          </m:sup>
-        </m:sSup>
-      </m:oMath>
-      <w:r>
-        <w:t xml:space="preserve">. </w:t>
-      </w:r>
-      <w:r>
-        <w:t xml:space="preserve">(figure </w:t>
-      </w:r>
-      <w:r>
-        <w:t>12</w:t>
-      </w:r>
-      <w:r>
-        <w:t>)</w:t>
-      </w:r>
-      <w:r>
-        <w:t xml:space="preserve">. </w:t>
-      </w:r>
-      <w:r>
-        <w:t>Cette valeur reste tout de même élevé ce qui confirme l’hypothèse que l’architecture du micro utilisé est un montage parallèle.</w:t>
-      </w:r>
-    </w:p>
-    <w:p>
-      <w:pPr>
-        <w:spacing w:line="360" w:lineRule="auto"/>
-        <w:jc w:val="both"/>
-      </w:pPr>
-      <w:r>
-        <w:t xml:space="preserve">Cette atténuation peut être synthétisée par le taux de rejection de mode commun (CMRR). L'écart observé entre le CMRR théorique de </w:t>
-      </w:r>
-      <w:r>
-        <w:t>37</w:t>
-      </w:r>
-      <w:r>
-        <w:t xml:space="preserve"> dB et la valeur expérimentale de </w:t>
-      </w:r>
-      <w:r>
-        <w:t>7,6</w:t>
-      </w:r>
-      <w:r>
-        <w:t xml:space="preserve"> dB souligne les limites de l'annulation parfaite dans un système réel. Cette différence s'explique principalement par les asymétries de construction des bobinages</w:t>
-      </w:r>
-      <w:r>
-        <w:t>, l’architecture parallèle du Humbucker utilisé</w:t>
-      </w:r>
-      <w:r>
-        <w:t xml:space="preserve"> et les imperfections du montage, qui rompent l'équilibre nécessaire à l'annulation totale. Néanmoins, l'expérience valide la supériorité du montage Humbucker pour la préservation de la pureté du signal électrique face aux interférences magnétiques de basse fréquence.</w:t>
-      </w:r>
-    </w:p>
-    <w:p>
-      <w:pPr>
-        <w:spacing w:line="360" w:lineRule="auto"/>
-        <w:ind w:firstLine="0"/>
-        <w:jc w:val="both"/>
-      </w:pPr>
-    </w:p>
-    <w:p>
-      <w:pPr>
-        <w:spacing w:line="360" w:lineRule="auto"/>
-        <w:ind w:firstLine="0"/>
-        <w:jc w:val="center"/>
-      </w:pPr>
-      <w:r>
-        <w:rPr>
-          <w:noProof/>
-        </w:rPr>
-        <w:lastRenderedPageBreak/>
-        <w:drawing>
-          <wp:inline distT="0" distB="0" distL="0" distR="0" wp14:anchorId="008DBD6E" wp14:editId="04B7B698">
-            <wp:extent cx="3600000" cy="2999999"/>
-            <wp:effectExtent l="0" t="0" r="635" b="0"/>
-            <wp:docPr id="415768725" name="Picture 1"/>
-            <wp:cNvGraphicFramePr>
-              <a:graphicFrameLocks xmlns:a="http://schemas.openxmlformats.org/drawingml/2006/main" noChangeAspect="1"/>
-            </wp:cNvGraphicFramePr>
-            <a:graphic xmlns:a="http://schemas.openxmlformats.org/drawingml/2006/main">
-              <a:graphicData uri="http://schemas.openxmlformats.org/drawingml/2006/picture">
-                <pic:pic xmlns:pic="http://schemas.openxmlformats.org/drawingml/2006/picture">
-                  <pic:nvPicPr>
-                    <pic:cNvPr id="415768725" name="Picture 1"/>
+                    <pic:cNvPr id="472058884" name="Picture 5"/>
                     <pic:cNvPicPr/>
                   </pic:nvPicPr>
                   <pic:blipFill>
@@ -10367,7 +10135,311 @@
                   <pic:spPr>
                     <a:xfrm>
                       <a:off x="0" y="0"/>
-                      <a:ext cx="3600000" cy="2999999"/>
+                      <a:ext cx="1908000" cy="1589999"/>
+                    </a:xfrm>
+                    <a:prstGeom prst="rect">
+                      <a:avLst/>
+                    </a:prstGeom>
+                  </pic:spPr>
+                </pic:pic>
+              </a:graphicData>
+            </a:graphic>
+          </wp:inline>
+        </w:drawing>
+      </w:r>
+      <w:r>
+        <w:rPr>
+          <w:noProof/>
+        </w:rPr>
+        <w:drawing>
+          <wp:inline distT="0" distB="0" distL="0" distR="0" wp14:anchorId="192D3E96" wp14:editId="0A1AC8A6">
+            <wp:extent cx="1908000" cy="1589999"/>
+            <wp:effectExtent l="0" t="0" r="0" b="0"/>
+            <wp:docPr id="644951845" name="Picture 5"/>
+            <wp:cNvGraphicFramePr>
+              <a:graphicFrameLocks xmlns:a="http://schemas.openxmlformats.org/drawingml/2006/main" noChangeAspect="1"/>
+            </wp:cNvGraphicFramePr>
+            <a:graphic xmlns:a="http://schemas.openxmlformats.org/drawingml/2006/main">
+              <a:graphicData uri="http://schemas.openxmlformats.org/drawingml/2006/picture">
+                <pic:pic xmlns:pic="http://schemas.openxmlformats.org/drawingml/2006/picture">
+                  <pic:nvPicPr>
+                    <pic:cNvPr id="644951845" name="Picture 5"/>
+                    <pic:cNvPicPr/>
+                  </pic:nvPicPr>
+                  <pic:blipFill>
+                    <a:blip r:embed="rId24" cstate="print">
+                      <a:extLst>
+                        <a:ext uri="{28A0092B-C50C-407E-A947-70E740481C1C}">
+                          <a14:useLocalDpi xmlns:a14="http://schemas.microsoft.com/office/drawing/2010/main" val="0"/>
+                        </a:ext>
+                      </a:extLst>
+                    </a:blip>
+                    <a:stretch>
+                      <a:fillRect/>
+                    </a:stretch>
+                  </pic:blipFill>
+                  <pic:spPr>
+                    <a:xfrm>
+                      <a:off x="0" y="0"/>
+                      <a:ext cx="1908000" cy="1589999"/>
+                    </a:xfrm>
+                    <a:prstGeom prst="rect">
+                      <a:avLst/>
+                    </a:prstGeom>
+                  </pic:spPr>
+                </pic:pic>
+              </a:graphicData>
+            </a:graphic>
+          </wp:inline>
+        </w:drawing>
+      </w:r>
+    </w:p>
+    <w:p>
+      <w:pPr>
+        <w:pStyle w:val="Caption"/>
+        <w:jc w:val="center"/>
+      </w:pPr>
+      <w:r>
+        <w:t>Figure 11 : Réponse temporelle du micro à un champ magnétique extérieur</w:t>
+      </w:r>
+    </w:p>
+    <w:p/>
+    <w:p>
+      <w:pPr>
+        <w:pStyle w:val="Heading3"/>
+        <w:spacing w:line="360" w:lineRule="auto"/>
+        <w:jc w:val="both"/>
+      </w:pPr>
+      <w:r>
+        <w:t>III.II.III. Taux de rejection de mode commun (CMRR)</w:t>
+      </w:r>
+    </w:p>
+    <w:p>
+      <w:pPr>
+        <w:spacing w:line="360" w:lineRule="auto"/>
+        <w:jc w:val="both"/>
+      </w:pPr>
+      <w:r>
+        <w:t xml:space="preserve">Le micro SingleCoil affiche une sensibilité expérimentale </w:t>
+      </w:r>
+      <m:oMath>
+        <m:sSub>
+          <m:sSubPr>
+            <m:ctrlPr>
+              <w:rPr>
+                <w:rFonts w:ascii="Cambria Math" w:hAnsi="Cambria Math"/>
+                <w:i/>
+              </w:rPr>
+            </m:ctrlPr>
+          </m:sSubPr>
+          <m:e>
+            <m:r>
+              <w:rPr>
+                <w:rFonts w:ascii="Cambria Math" w:hAnsi="Cambria Math"/>
+              </w:rPr>
+              <m:t>k</m:t>
+            </m:r>
+          </m:e>
+          <m:sub>
+            <m:r>
+              <w:rPr>
+                <w:rFonts w:ascii="Cambria Math" w:hAnsi="Cambria Math"/>
+              </w:rPr>
+              <m:t>Sexp</m:t>
+            </m:r>
+          </m:sub>
+        </m:sSub>
+        <m:r>
+          <w:rPr>
+            <w:rFonts w:ascii="Cambria Math" w:hAnsi="Cambria Math"/>
+          </w:rPr>
+          <m:t>=1,48 mV.μ</m:t>
+        </m:r>
+        <m:sSup>
+          <m:sSupPr>
+            <m:ctrlPr>
+              <w:rPr>
+                <w:rFonts w:ascii="Cambria Math" w:hAnsi="Cambria Math"/>
+                <w:i/>
+              </w:rPr>
+            </m:ctrlPr>
+          </m:sSupPr>
+          <m:e>
+            <m:r>
+              <w:rPr>
+                <w:rFonts w:ascii="Cambria Math" w:hAnsi="Cambria Math"/>
+              </w:rPr>
+              <m:t>T</m:t>
+            </m:r>
+          </m:e>
+          <m:sup>
+            <m:r>
+              <w:rPr>
+                <w:rFonts w:ascii="Cambria Math" w:hAnsi="Cambria Math"/>
+              </w:rPr>
+              <m:t>-1</m:t>
+            </m:r>
+          </m:sup>
+        </m:sSup>
+      </m:oMath>
+      <w:r>
+        <w:t xml:space="preserve">, tandis que le micro Humbucker présente une sensibilité </w:t>
+      </w:r>
+      <m:oMath>
+        <m:sSub>
+          <m:sSubPr>
+            <m:ctrlPr>
+              <w:rPr>
+                <w:rFonts w:ascii="Cambria Math" w:hAnsi="Cambria Math"/>
+                <w:i/>
+              </w:rPr>
+            </m:ctrlPr>
+          </m:sSubPr>
+          <m:e>
+            <m:r>
+              <w:rPr>
+                <w:rFonts w:ascii="Cambria Math" w:hAnsi="Cambria Math"/>
+              </w:rPr>
+              <m:t>k</m:t>
+            </m:r>
+          </m:e>
+          <m:sub>
+            <m:r>
+              <w:rPr>
+                <w:rFonts w:ascii="Cambria Math" w:hAnsi="Cambria Math"/>
+              </w:rPr>
+              <m:t>Hpexp</m:t>
+            </m:r>
+          </m:sub>
+        </m:sSub>
+        <m:r>
+          <w:rPr>
+            <w:rFonts w:ascii="Cambria Math" w:hAnsi="Cambria Math"/>
+          </w:rPr>
+          <m:t>=0,62 mV.μ</m:t>
+        </m:r>
+        <m:sSup>
+          <m:sSupPr>
+            <m:ctrlPr>
+              <w:rPr>
+                <w:rFonts w:ascii="Cambria Math" w:hAnsi="Cambria Math"/>
+                <w:i/>
+              </w:rPr>
+            </m:ctrlPr>
+          </m:sSupPr>
+          <m:e>
+            <m:r>
+              <w:rPr>
+                <w:rFonts w:ascii="Cambria Math" w:hAnsi="Cambria Math"/>
+              </w:rPr>
+              <m:t>T</m:t>
+            </m:r>
+          </m:e>
+          <m:sup>
+            <m:r>
+              <w:rPr>
+                <w:rFonts w:ascii="Cambria Math" w:hAnsi="Cambria Math"/>
+              </w:rPr>
+              <m:t>-1</m:t>
+            </m:r>
+          </m:sup>
+        </m:sSup>
+      </m:oMath>
+      <w:r>
+        <w:t xml:space="preserve">. </w:t>
+      </w:r>
+      <w:r>
+        <w:t xml:space="preserve">(figure </w:t>
+      </w:r>
+      <w:r>
+        <w:t>12</w:t>
+      </w:r>
+      <w:r>
+        <w:t>)</w:t>
+      </w:r>
+      <w:r>
+        <w:t xml:space="preserve">. </w:t>
+      </w:r>
+      <w:r>
+        <w:t>Cette valeur reste tout de même élevé ce qui confirme l’hypothèse que l’architecture du micro utilisé est un montage parallèle.</w:t>
+      </w:r>
+    </w:p>
+    <w:p>
+      <w:pPr>
+        <w:spacing w:line="360" w:lineRule="auto"/>
+        <w:jc w:val="both"/>
+      </w:pPr>
+      <w:r>
+        <w:t xml:space="preserve">Cette atténuation peut être synthétisée par le taux de rejection de mode commun (CMRR). L'écart observé entre le CMRR théorique de </w:t>
+      </w:r>
+      <w:r>
+        <w:t>37</w:t>
+      </w:r>
+      <w:r>
+        <w:t xml:space="preserve"> dB et la valeur expérimentale de </w:t>
+      </w:r>
+      <w:r>
+        <w:t>7,6</w:t>
+      </w:r>
+      <w:r>
+        <w:t xml:space="preserve"> dB souligne les limites de l'annulation parfaite dans un système réel. Cette différence s'explique principalement par les asymétries de construction des bobinages</w:t>
+      </w:r>
+      <w:r>
+        <w:t>, l’architecture parallèle du Humbucker utilisé</w:t>
+      </w:r>
+      <w:r>
+        <w:t xml:space="preserve"> et les imperfections du montage, qui rompent l'équilibre nécessaire à l'annulation totale. Néanmoins, l'expérience valide la supériorité du montage Humbucker pour la préservation de la pureté du signal électrique face aux interférences magnétiques de basse fréquence.</w:t>
+      </w:r>
+    </w:p>
+    <w:p>
+      <w:pPr>
+        <w:spacing w:line="360" w:lineRule="auto"/>
+        <w:ind w:firstLine="0"/>
+        <w:jc w:val="both"/>
+      </w:pPr>
+    </w:p>
+    <w:p>
+      <w:pPr>
+        <w:spacing w:line="360" w:lineRule="auto"/>
+        <w:ind w:firstLine="0"/>
+        <w:jc w:val="center"/>
+      </w:pPr>
+      <w:r>
+        <w:rPr>
+          <w:noProof/>
+        </w:rPr>
+        <w:lastRenderedPageBreak/>
+        <w:drawing>
+          <wp:inline distT="0" distB="0" distL="0" distR="0" wp14:anchorId="008DBD6E" wp14:editId="050ACB02">
+            <wp:extent cx="3599998" cy="2999999"/>
+            <wp:effectExtent l="0" t="0" r="635" b="0"/>
+            <wp:docPr id="415768725" name="Picture 1"/>
+            <wp:cNvGraphicFramePr>
+              <a:graphicFrameLocks xmlns:a="http://schemas.openxmlformats.org/drawingml/2006/main" noChangeAspect="1"/>
+            </wp:cNvGraphicFramePr>
+            <a:graphic xmlns:a="http://schemas.openxmlformats.org/drawingml/2006/main">
+              <a:graphicData uri="http://schemas.openxmlformats.org/drawingml/2006/picture">
+                <pic:pic xmlns:pic="http://schemas.openxmlformats.org/drawingml/2006/picture">
+                  <pic:nvPicPr>
+                    <pic:cNvPr id="415768725" name="Picture 1"/>
+                    <pic:cNvPicPr/>
+                  </pic:nvPicPr>
+                  <pic:blipFill>
+                    <a:blip r:embed="rId25" cstate="print">
+                      <a:extLst>
+                        <a:ext uri="{28A0092B-C50C-407E-A947-70E740481C1C}">
+                          <a14:useLocalDpi xmlns:a14="http://schemas.microsoft.com/office/drawing/2010/main" val="0"/>
+                        </a:ext>
+                      </a:extLst>
+                    </a:blip>
+                    <a:stretch>
+                      <a:fillRect/>
+                    </a:stretch>
+                  </pic:blipFill>
+                  <pic:spPr>
+                    <a:xfrm>
+                      <a:off x="0" y="0"/>
+                      <a:ext cx="3599998" cy="2999999"/>
                     </a:xfrm>
                     <a:prstGeom prst="rect">
                       <a:avLst/>
@@ -10748,12 +10820,14 @@
               <w:spacing w:line="360" w:lineRule="auto"/>
               <w:jc w:val="both"/>
               <w:rPr>
+                <w:rFonts w:ascii="Cambria Math" w:hAnsi="Cambria Math"/>
                 <w:b/>
                 <w:bCs/>
               </w:rPr>
             </w:pPr>
             <w:r>
               <w:rPr>
+                <w:rFonts w:ascii="Cambria Math" w:hAnsi="Cambria Math"/>
                 <w:b/>
                 <w:bCs/>
               </w:rPr>
@@ -10859,6 +10933,9 @@
             <w:pPr>
               <w:spacing w:line="360" w:lineRule="auto"/>
               <w:jc w:val="both"/>
+              <w:rPr>
+                <w:rFonts w:ascii="Cambria Math" w:hAnsi="Cambria Math"/>
+              </w:rPr>
             </w:pPr>
             <m:oMathPara>
               <m:oMathParaPr>
@@ -11023,7 +11100,7 @@
               <w:spacing w:line="360" w:lineRule="auto"/>
               <w:jc w:val="both"/>
               <w:rPr>
-                <w:rFonts w:ascii="Times New Roman" w:eastAsia="SimSun" w:hAnsi="Times New Roman" w:cs="Times New Roman"/>
+                <w:rFonts w:ascii="Cambria Math" w:eastAsia="SimSun" w:hAnsi="Cambria Math" w:cs="Times New Roman"/>
               </w:rPr>
             </w:pPr>
             <m:oMathPara>
@@ -11115,12 +11192,12 @@
             <w:pPr>
               <w:spacing w:line="360" w:lineRule="auto"/>
               <w:rPr>
-                <w:rFonts w:ascii="Times New Roman" w:eastAsia="SimSun" w:hAnsi="Times New Roman" w:cs="Times New Roman"/>
+                <w:rFonts w:ascii="Cambria Math" w:eastAsia="SimSun" w:hAnsi="Cambria Math" w:cs="Times New Roman"/>
               </w:rPr>
             </w:pPr>
             <w:r>
               <w:rPr>
-                <w:rFonts w:ascii="Times New Roman" w:eastAsia="SimSun" w:hAnsi="Times New Roman" w:cs="Times New Roman"/>
+                <w:rFonts w:ascii="Cambria Math" w:eastAsia="SimSun" w:hAnsi="Cambria Math" w:cs="Times New Roman"/>
               </w:rPr>
               <w:t>-</w:t>
             </w:r>
@@ -11207,12 +11284,12 @@
             <w:pPr>
               <w:spacing w:line="360" w:lineRule="auto"/>
               <w:rPr>
-                <w:rFonts w:ascii="Times New Roman" w:eastAsia="SimSun" w:hAnsi="Times New Roman" w:cs="Times New Roman"/>
+                <w:rFonts w:ascii="Cambria Math" w:eastAsia="SimSun" w:hAnsi="Cambria Math" w:cs="Times New Roman"/>
               </w:rPr>
             </w:pPr>
             <w:r>
               <w:rPr>
-                <w:rFonts w:ascii="Times New Roman" w:eastAsia="SimSun" w:hAnsi="Times New Roman" w:cs="Times New Roman"/>
+                <w:rFonts w:ascii="Cambria Math" w:eastAsia="SimSun" w:hAnsi="Cambria Math" w:cs="Times New Roman"/>
               </w:rPr>
               <w:t>-</w:t>
             </w:r>
@@ -11325,12 +11402,12 @@
             <w:pPr>
               <w:spacing w:line="360" w:lineRule="auto"/>
               <w:rPr>
-                <w:rFonts w:ascii="Times New Roman" w:eastAsia="SimSun" w:hAnsi="Times New Roman" w:cs="Times New Roman"/>
+                <w:rFonts w:ascii="Cambria Math" w:eastAsia="SimSun" w:hAnsi="Cambria Math" w:cs="Times New Roman"/>
               </w:rPr>
             </w:pPr>
             <w:r>
               <w:rPr>
-                <w:rFonts w:ascii="Times New Roman" w:eastAsia="SimSun" w:hAnsi="Times New Roman" w:cs="Times New Roman"/>
+                <w:rFonts w:ascii="Cambria Math" w:eastAsia="SimSun" w:hAnsi="Cambria Math" w:cs="Times New Roman"/>
               </w:rPr>
               <w:t>-</w:t>
             </w:r>
@@ -11417,12 +11494,12 @@
             <w:pPr>
               <w:spacing w:line="360" w:lineRule="auto"/>
               <w:rPr>
-                <w:rFonts w:ascii="Times New Roman" w:eastAsia="SimSun" w:hAnsi="Times New Roman" w:cs="Times New Roman"/>
+                <w:rFonts w:ascii="Cambria Math" w:eastAsia="SimSun" w:hAnsi="Cambria Math" w:cs="Times New Roman"/>
               </w:rPr>
             </w:pPr>
             <w:r>
               <w:rPr>
-                <w:rFonts w:ascii="Times New Roman" w:eastAsia="SimSun" w:hAnsi="Times New Roman" w:cs="Times New Roman"/>
+                <w:rFonts w:ascii="Cambria Math" w:eastAsia="SimSun" w:hAnsi="Cambria Math" w:cs="Times New Roman"/>
               </w:rPr>
               <w:t>-</w:t>
             </w:r>
@@ -11536,6 +11613,9 @@
             <w:pPr>
               <w:spacing w:line="360" w:lineRule="auto"/>
               <w:jc w:val="both"/>
+              <w:rPr>
+                <w:rFonts w:ascii="Cambria Math" w:hAnsi="Cambria Math"/>
+              </w:rPr>
             </w:pPr>
             <m:oMathPara>
               <m:oMathParaPr>
@@ -11546,7 +11626,19 @@
                   <w:rPr>
                     <w:rFonts w:ascii="Cambria Math" w:hAnsi="Cambria Math"/>
                   </w:rPr>
-                  <m:t>5,3.</m:t>
+                  <m:t>5,</m:t>
+                </m:r>
+                <m:r>
+                  <w:rPr>
+                    <w:rFonts w:ascii="Cambria Math" w:hAnsi="Cambria Math"/>
+                  </w:rPr>
+                  <m:t>26</m:t>
+                </m:r>
+                <m:r>
+                  <w:rPr>
+                    <w:rFonts w:ascii="Cambria Math" w:hAnsi="Cambria Math"/>
+                  </w:rPr>
+                  <m:t>.</m:t>
                 </m:r>
                 <m:sSup>
                   <m:sSupPr>
@@ -11701,6 +11793,9 @@
             <w:pPr>
               <w:spacing w:line="360" w:lineRule="auto"/>
               <w:jc w:val="both"/>
+              <w:rPr>
+                <w:rFonts w:ascii="Cambria Math" w:hAnsi="Cambria Math"/>
+              </w:rPr>
             </w:pPr>
             <m:oMathPara>
               <m:oMathParaPr>
@@ -11711,7 +11806,13 @@
                   <w:rPr>
                     <w:rFonts w:ascii="Cambria Math" w:hAnsi="Cambria Math"/>
                   </w:rPr>
-                  <m:t>2,40</m:t>
+                  <m:t>2,4</m:t>
+                </m:r>
+                <m:r>
+                  <w:rPr>
+                    <w:rFonts w:ascii="Cambria Math" w:hAnsi="Cambria Math"/>
+                  </w:rPr>
+                  <m:t>3</m:t>
                 </m:r>
               </m:oMath>
             </m:oMathPara>
@@ -11809,6 +11910,9 @@
             <w:pPr>
               <w:spacing w:line="360" w:lineRule="auto"/>
               <w:jc w:val="both"/>
+              <w:rPr>
+                <w:rFonts w:ascii="Cambria Math" w:hAnsi="Cambria Math"/>
+              </w:rPr>
             </w:pPr>
             <m:oMathPara>
               <m:oMathParaPr>
@@ -11963,6 +12067,9 @@
             <w:pPr>
               <w:spacing w:line="360" w:lineRule="auto"/>
               <w:jc w:val="both"/>
+              <w:rPr>
+                <w:rFonts w:ascii="Cambria Math" w:hAnsi="Cambria Math"/>
+              </w:rPr>
             </w:pPr>
             <m:oMathPara>
               <m:oMathParaPr>
@@ -11973,7 +12080,19 @@
                   <w:rPr>
                     <w:rFonts w:ascii="Cambria Math" w:hAnsi="Cambria Math"/>
                   </w:rPr>
-                  <m:t>507.</m:t>
+                  <m:t>5</m:t>
+                </m:r>
+                <m:r>
+                  <w:rPr>
+                    <w:rFonts w:ascii="Cambria Math" w:hAnsi="Cambria Math"/>
+                  </w:rPr>
+                  <m:t>00</m:t>
+                </m:r>
+                <m:r>
+                  <w:rPr>
+                    <w:rFonts w:ascii="Cambria Math" w:hAnsi="Cambria Math"/>
+                  </w:rPr>
+                  <m:t>.</m:t>
                 </m:r>
                 <m:sSup>
                   <m:sSupPr>
@@ -12105,8 +12224,14 @@
           <w:p>
             <w:pPr>
               <w:spacing w:line="360" w:lineRule="auto"/>
+              <w:rPr>
+                <w:rFonts w:ascii="Cambria Math" w:hAnsi="Cambria Math"/>
+              </w:rPr>
             </w:pPr>
             <w:r>
+              <w:rPr>
+                <w:rFonts w:ascii="Cambria Math" w:hAnsi="Cambria Math"/>
+              </w:rPr>
               <w:t>-</w:t>
             </w:r>
           </w:p>
@@ -12226,6 +12351,9 @@
             <w:pPr>
               <w:spacing w:line="360" w:lineRule="auto"/>
               <w:jc w:val="both"/>
+              <w:rPr>
+                <w:rFonts w:ascii="Cambria Math" w:hAnsi="Cambria Math"/>
+              </w:rPr>
             </w:pPr>
             <m:oMathPara>
               <m:oMathParaPr>
@@ -12366,6 +12494,9 @@
             <w:pPr>
               <w:spacing w:line="360" w:lineRule="auto"/>
               <w:jc w:val="both"/>
+              <w:rPr>
+                <w:rFonts w:ascii="Cambria Math" w:hAnsi="Cambria Math"/>
+              </w:rPr>
             </w:pPr>
             <m:oMathPara>
               <m:oMathParaPr>
@@ -12376,7 +12507,13 @@
                   <w:rPr>
                     <w:rFonts w:ascii="Cambria Math" w:hAnsi="Cambria Math"/>
                   </w:rPr>
-                  <m:t>1,84</m:t>
+                  <m:t>1,</m:t>
+                </m:r>
+                <m:r>
+                  <w:rPr>
+                    <w:rFonts w:ascii="Cambria Math" w:hAnsi="Cambria Math"/>
+                  </w:rPr>
+                  <m:t>77</m:t>
                 </m:r>
               </m:oMath>
             </m:oMathPara>
@@ -12477,6 +12614,9 @@
             <w:pPr>
               <w:spacing w:line="360" w:lineRule="auto"/>
               <w:jc w:val="both"/>
+              <w:rPr>
+                <w:rFonts w:ascii="Cambria Math" w:hAnsi="Cambria Math"/>
+              </w:rPr>
             </w:pPr>
             <m:oMathPara>
               <m:oMathParaPr>
@@ -12634,6 +12774,9 @@
             <w:pPr>
               <w:spacing w:line="360" w:lineRule="auto"/>
               <w:jc w:val="both"/>
+              <w:rPr>
+                <w:rFonts w:ascii="Cambria Math" w:hAnsi="Cambria Math"/>
+              </w:rPr>
             </w:pPr>
             <m:oMathPara>
               <m:oMathParaPr>
@@ -12644,7 +12787,19 @@
                   <w:rPr>
                     <w:rFonts w:ascii="Cambria Math" w:hAnsi="Cambria Math"/>
                   </w:rPr>
-                  <m:t>346.</m:t>
+                  <m:t>3</m:t>
+                </m:r>
+                <m:r>
+                  <w:rPr>
+                    <w:rFonts w:ascii="Cambria Math" w:hAnsi="Cambria Math"/>
+                  </w:rPr>
+                  <m:t>51</m:t>
+                </m:r>
+                <m:r>
+                  <w:rPr>
+                    <w:rFonts w:ascii="Cambria Math" w:hAnsi="Cambria Math"/>
+                  </w:rPr>
+                  <m:t>.</m:t>
                 </m:r>
                 <m:sSup>
                   <m:sSupPr>
@@ -12789,12 +12944,14 @@
             <w:pPr>
               <w:spacing w:line="360" w:lineRule="auto"/>
               <w:rPr>
+                <w:rFonts w:ascii="Cambria Math" w:hAnsi="Cambria Math"/>
                 <w:sz w:val="22"/>
                 <w:szCs w:val="22"/>
               </w:rPr>
             </w:pPr>
             <w:r>
               <w:rPr>
+                <w:rFonts w:ascii="Cambria Math" w:hAnsi="Cambria Math"/>
                 <w:sz w:val="22"/>
                 <w:szCs w:val="22"/>
               </w:rPr>
@@ -12940,10 +13097,67 @@
           <w:p>
             <w:pPr>
               <w:spacing w:line="360" w:lineRule="auto"/>
+              <w:rPr>
+                <w:rFonts w:ascii="Cambria Math" w:hAnsi="Cambria Math"/>
+              </w:rPr>
             </w:pPr>
-            <w:r>
-              <w:t>?</w:t>
-            </w:r>
+            <m:oMathPara>
+              <m:oMathParaPr>
+                <m:jc m:val="left"/>
+              </m:oMathParaPr>
+              <m:oMath>
+                <m:r>
+                  <w:rPr>
+                    <w:rFonts w:ascii="Cambria Math" w:hAnsi="Cambria Math"/>
+                  </w:rPr>
+                  <m:t>15</m:t>
+                </m:r>
+                <m:r>
+                  <w:rPr>
+                    <w:rFonts w:ascii="Cambria Math" w:hAnsi="Cambria Math"/>
+                  </w:rPr>
+                  <m:t>,</m:t>
+                </m:r>
+                <m:r>
+                  <w:rPr>
+                    <w:rFonts w:ascii="Cambria Math" w:hAnsi="Cambria Math"/>
+                  </w:rPr>
+                  <m:t>10</m:t>
+                </m:r>
+                <m:r>
+                  <w:rPr>
+                    <w:rFonts w:ascii="Cambria Math" w:hAnsi="Cambria Math"/>
+                  </w:rPr>
+                  <m:t>.</m:t>
+                </m:r>
+                <m:sSup>
+                  <m:sSupPr>
+                    <m:ctrlPr>
+                      <w:rPr>
+                        <w:rFonts w:ascii="Cambria Math" w:hAnsi="Cambria Math"/>
+                        <w:i/>
+                      </w:rPr>
+                    </m:ctrlPr>
+                  </m:sSupPr>
+                  <m:e>
+                    <m:r>
+                      <w:rPr>
+                        <w:rFonts w:ascii="Cambria Math" w:hAnsi="Cambria Math"/>
+                      </w:rPr>
+                      <m:t>10</m:t>
+                    </m:r>
+                  </m:e>
+                  <m:sup>
+                    <m:r>
+                      <w:rPr>
+                        <w:rFonts w:ascii="Cambria Math" w:hAnsi="Cambria Math"/>
+                      </w:rPr>
+                      <m:t>3</m:t>
+                    </m:r>
+                  </m:sup>
+                </m:sSup>
+              </m:oMath>
+            </m:oMathPara>
           </w:p>
         </w:tc>
         <w:tc>
@@ -13047,9 +13261,15 @@
             <w:pPr>
               <w:spacing w:line="360" w:lineRule="auto"/>
               <w:jc w:val="both"/>
+              <w:rPr>
+                <w:rFonts w:ascii="Cambria Math" w:hAnsi="Cambria Math"/>
+              </w:rPr>
             </w:pPr>
             <w:r>
-              <w:t>?</w:t>
+              <w:rPr>
+                <w:rFonts w:ascii="Cambria Math" w:hAnsi="Cambria Math"/>
+              </w:rPr>
+              <w:t>4,71</w:t>
             </w:r>
           </w:p>
         </w:tc>
@@ -13147,17 +13367,52 @@
           <w:p>
             <w:pPr>
               <w:spacing w:line="360" w:lineRule="auto"/>
-              <w:jc w:val="both"/>
-              <w:rPr>
-                <w:rFonts w:ascii="Times New Roman" w:eastAsia="SimSun" w:hAnsi="Times New Roman" w:cs="Times New Roman"/>
+              <w:rPr>
+                <w:rFonts w:ascii="Cambria Math" w:eastAsia="SimSun" w:hAnsi="Cambria Math" w:cs="Times New Roman"/>
               </w:rPr>
             </w:pPr>
-            <w:r>
-              <w:rPr>
-                <w:rFonts w:ascii="Times New Roman" w:eastAsia="SimSun" w:hAnsi="Times New Roman" w:cs="Times New Roman"/>
-              </w:rPr>
-              <w:t>?</w:t>
-            </w:r>
+            <m:oMathPara>
+              <m:oMath>
+                <m:r>
+                  <w:rPr>
+                    <w:rFonts w:ascii="Cambria Math" w:hAnsi="Cambria Math"/>
+                  </w:rPr>
+                  <m:t>11</m:t>
+                </m:r>
+                <m:r>
+                  <w:rPr>
+                    <w:rFonts w:ascii="Cambria Math" w:hAnsi="Cambria Math"/>
+                  </w:rPr>
+                  <m:t>0.</m:t>
+                </m:r>
+                <m:sSup>
+                  <m:sSupPr>
+                    <m:ctrlPr>
+                      <w:rPr>
+                        <w:rFonts w:ascii="Cambria Math" w:hAnsi="Cambria Math"/>
+                        <w:i/>
+                      </w:rPr>
+                    </m:ctrlPr>
+                  </m:sSupPr>
+                  <m:e>
+                    <m:r>
+                      <w:rPr>
+                        <w:rFonts w:ascii="Cambria Math" w:hAnsi="Cambria Math"/>
+                      </w:rPr>
+                      <m:t>10</m:t>
+                    </m:r>
+                  </m:e>
+                  <m:sup>
+                    <m:r>
+                      <w:rPr>
+                        <w:rFonts w:ascii="Cambria Math" w:hAnsi="Cambria Math"/>
+                      </w:rPr>
+                      <m:t>-12</m:t>
+                    </m:r>
+                  </m:sup>
+                </m:sSup>
+              </m:oMath>
+            </m:oMathPara>
           </w:p>
         </w:tc>
         <w:tc>
@@ -13279,15 +13534,57 @@
               <w:spacing w:line="360" w:lineRule="auto"/>
               <w:jc w:val="both"/>
               <w:rPr>
-                <w:rFonts w:ascii="Times New Roman" w:eastAsia="SimSun" w:hAnsi="Times New Roman" w:cs="Times New Roman"/>
+                <w:rFonts w:ascii="Cambria Math" w:eastAsia="SimSun" w:hAnsi="Cambria Math" w:cs="Times New Roman"/>
               </w:rPr>
             </w:pPr>
-            <w:r>
-              <w:rPr>
-                <w:rFonts w:ascii="Times New Roman" w:eastAsia="SimSun" w:hAnsi="Times New Roman" w:cs="Times New Roman"/>
-              </w:rPr>
-              <w:t>?</w:t>
-            </w:r>
+            <m:oMathPara>
+              <m:oMath>
+                <m:r>
+                  <w:rPr>
+                    <w:rFonts w:ascii="Cambria Math" w:hAnsi="Cambria Math"/>
+                  </w:rPr>
+                  <m:t>1</m:t>
+                </m:r>
+                <m:r>
+                  <w:rPr>
+                    <w:rFonts w:ascii="Cambria Math" w:hAnsi="Cambria Math"/>
+                  </w:rPr>
+                  <m:t>,07</m:t>
+                </m:r>
+                <m:r>
+                  <w:rPr>
+                    <w:rFonts w:ascii="Cambria Math" w:hAnsi="Cambria Math"/>
+                  </w:rPr>
+                  <m:t>.</m:t>
+                </m:r>
+                <m:sSup>
+                  <m:sSupPr>
+                    <m:ctrlPr>
+                      <w:rPr>
+                        <w:rFonts w:ascii="Cambria Math" w:hAnsi="Cambria Math"/>
+                        <w:i/>
+                      </w:rPr>
+                    </m:ctrlPr>
+                  </m:sSupPr>
+                  <m:e>
+                    <m:r>
+                      <w:rPr>
+                        <w:rFonts w:ascii="Cambria Math" w:hAnsi="Cambria Math"/>
+                      </w:rPr>
+                      <m:t>10</m:t>
+                    </m:r>
+                  </m:e>
+                  <m:sup>
+                    <m:r>
+                      <w:rPr>
+                        <w:rFonts w:ascii="Cambria Math" w:hAnsi="Cambria Math"/>
+                      </w:rPr>
+                      <m:t>6</m:t>
+                    </m:r>
+                  </m:sup>
+                </m:sSup>
+              </m:oMath>
+            </m:oMathPara>
           </w:p>
         </w:tc>
         <w:tc>
@@ -13398,12 +13695,12 @@
               <w:spacing w:line="360" w:lineRule="auto"/>
               <w:jc w:val="both"/>
               <w:rPr>
-                <w:rFonts w:ascii="Times New Roman" w:eastAsia="SimSun" w:hAnsi="Times New Roman" w:cs="Times New Roman"/>
+                <w:rFonts w:ascii="Cambria Math" w:eastAsia="SimSun" w:hAnsi="Cambria Math" w:cs="Times New Roman"/>
               </w:rPr>
             </w:pPr>
             <w:r>
               <w:rPr>
-                <w:rFonts w:ascii="Times New Roman" w:eastAsia="SimSun" w:hAnsi="Times New Roman" w:cs="Times New Roman"/>
+                <w:rFonts w:ascii="Cambria Math" w:eastAsia="SimSun" w:hAnsi="Cambria Math" w:cs="Times New Roman"/>
               </w:rPr>
               <w:t>-</w:t>
             </w:r>
@@ -13491,12 +13788,12 @@
               <w:spacing w:line="360" w:lineRule="auto"/>
               <w:jc w:val="both"/>
               <w:rPr>
-                <w:rFonts w:ascii="Times New Roman" w:eastAsia="SimSun" w:hAnsi="Times New Roman" w:cs="Times New Roman"/>
+                <w:rFonts w:ascii="Cambria Math" w:eastAsia="SimSun" w:hAnsi="Cambria Math" w:cs="Times New Roman"/>
               </w:rPr>
             </w:pPr>
             <w:r>
               <w:rPr>
-                <w:rFonts w:ascii="Times New Roman" w:eastAsia="SimSun" w:hAnsi="Times New Roman" w:cs="Times New Roman"/>
+                <w:rFonts w:ascii="Cambria Math" w:eastAsia="SimSun" w:hAnsi="Cambria Math" w:cs="Times New Roman"/>
               </w:rPr>
               <w:t>-</w:t>
             </w:r>
@@ -13601,12 +13898,12 @@
               <w:spacing w:line="360" w:lineRule="auto"/>
               <w:jc w:val="both"/>
               <w:rPr>
-                <w:rFonts w:ascii="Times New Roman" w:eastAsia="SimSun" w:hAnsi="Times New Roman" w:cs="Times New Roman"/>
+                <w:rFonts w:ascii="Cambria Math" w:eastAsia="SimSun" w:hAnsi="Cambria Math" w:cs="Times New Roman"/>
               </w:rPr>
             </w:pPr>
             <w:r>
               <w:rPr>
-                <w:rFonts w:ascii="Times New Roman" w:eastAsia="SimSun" w:hAnsi="Times New Roman" w:cs="Times New Roman"/>
+                <w:rFonts w:ascii="Cambria Math" w:eastAsia="SimSun" w:hAnsi="Cambria Math" w:cs="Times New Roman"/>
               </w:rPr>
               <w:t>0,004</w:t>
             </w:r>
@@ -13691,12 +13988,12 @@
               <w:spacing w:line="360" w:lineRule="auto"/>
               <w:jc w:val="both"/>
               <w:rPr>
-                <w:rFonts w:ascii="Times New Roman" w:eastAsia="SimSun" w:hAnsi="Times New Roman" w:cs="Times New Roman"/>
+                <w:rFonts w:ascii="Cambria Math" w:eastAsia="SimSun" w:hAnsi="Cambria Math" w:cs="Times New Roman"/>
               </w:rPr>
             </w:pPr>
             <w:r>
               <w:rPr>
-                <w:rFonts w:ascii="Times New Roman" w:eastAsia="SimSun" w:hAnsi="Times New Roman" w:cs="Times New Roman"/>
+                <w:rFonts w:ascii="Cambria Math" w:eastAsia="SimSun" w:hAnsi="Cambria Math" w:cs="Times New Roman"/>
               </w:rPr>
               <w:t>0,85</w:t>
             </w:r>
@@ -13801,14 +14098,20 @@
               <w:spacing w:line="360" w:lineRule="auto"/>
               <w:jc w:val="both"/>
               <w:rPr>
-                <w:rFonts w:ascii="Times New Roman" w:eastAsia="SimSun" w:hAnsi="Times New Roman" w:cs="Times New Roman"/>
+                <w:rFonts w:ascii="Cambria Math" w:eastAsia="SimSun" w:hAnsi="Cambria Math" w:cs="Times New Roman"/>
               </w:rPr>
             </w:pPr>
             <w:r>
               <w:rPr>
-                <w:rFonts w:ascii="Times New Roman" w:eastAsia="SimSun" w:hAnsi="Times New Roman" w:cs="Times New Roman"/>
-              </w:rPr>
-              <w:t>0,18</w:t>
+                <w:rFonts w:ascii="Cambria Math" w:eastAsia="SimSun" w:hAnsi="Cambria Math" w:cs="Times New Roman"/>
+              </w:rPr>
+              <w:t>0,</w:t>
+            </w:r>
+            <w:r>
+              <w:rPr>
+                <w:rFonts w:ascii="Cambria Math" w:eastAsia="SimSun" w:hAnsi="Cambria Math" w:cs="Times New Roman"/>
+              </w:rPr>
+              <w:t>300</w:t>
             </w:r>
           </w:p>
         </w:tc>
@@ -13910,14 +14213,20 @@
               <w:spacing w:line="360" w:lineRule="auto"/>
               <w:jc w:val="both"/>
               <w:rPr>
-                <w:rFonts w:ascii="Times New Roman" w:eastAsia="SimSun" w:hAnsi="Times New Roman" w:cs="Times New Roman"/>
+                <w:rFonts w:ascii="Cambria Math" w:eastAsia="SimSun" w:hAnsi="Cambria Math" w:cs="Times New Roman"/>
               </w:rPr>
             </w:pPr>
             <w:r>
               <w:rPr>
-                <w:rFonts w:ascii="Times New Roman" w:eastAsia="SimSun" w:hAnsi="Times New Roman" w:cs="Times New Roman"/>
-              </w:rPr>
-              <w:t>0,002</w:t>
+                <w:rFonts w:ascii="Cambria Math" w:eastAsia="SimSun" w:hAnsi="Cambria Math" w:cs="Times New Roman"/>
+              </w:rPr>
+              <w:t>0,00</w:t>
+            </w:r>
+            <w:r>
+              <w:rPr>
+                <w:rFonts w:ascii="Cambria Math" w:eastAsia="SimSun" w:hAnsi="Cambria Math" w:cs="Times New Roman"/>
+              </w:rPr>
+              <w:t>1</w:t>
             </w:r>
           </w:p>
         </w:tc>
@@ -14019,12 +14328,12 @@
               <w:spacing w:line="360" w:lineRule="auto"/>
               <w:jc w:val="both"/>
               <w:rPr>
-                <w:rFonts w:ascii="Times New Roman" w:eastAsia="SimSun" w:hAnsi="Times New Roman" w:cs="Times New Roman"/>
+                <w:rFonts w:ascii="Cambria Math" w:eastAsia="SimSun" w:hAnsi="Cambria Math" w:cs="Times New Roman"/>
               </w:rPr>
             </w:pPr>
             <w:r>
               <w:rPr>
-                <w:rFonts w:ascii="Times New Roman" w:eastAsia="SimSun" w:hAnsi="Times New Roman" w:cs="Times New Roman"/>
+                <w:rFonts w:ascii="Cambria Math" w:eastAsia="SimSun" w:hAnsi="Cambria Math" w:cs="Times New Roman"/>
               </w:rPr>
               <w:t>-</w:t>
             </w:r>
@@ -14116,14 +14425,14 @@
               <w:spacing w:line="360" w:lineRule="auto"/>
               <w:jc w:val="both"/>
               <w:rPr>
-                <w:rFonts w:ascii="Times New Roman" w:eastAsia="SimSun" w:hAnsi="Times New Roman" w:cs="Times New Roman"/>
+                <w:rFonts w:ascii="Cambria Math" w:eastAsia="SimSun" w:hAnsi="Cambria Math" w:cs="Times New Roman"/>
               </w:rPr>
             </w:pPr>
             <w:r>
               <w:rPr>
-                <w:rFonts w:ascii="Times New Roman" w:eastAsia="SimSun" w:hAnsi="Times New Roman" w:cs="Times New Roman"/>
-              </w:rPr>
-              <w:t>78</w:t>
+                <w:rFonts w:ascii="Cambria Math" w:eastAsia="SimSun" w:hAnsi="Cambria Math" w:cs="Times New Roman"/>
+              </w:rPr>
+              <w:t>80</w:t>
             </w:r>
           </w:p>
         </w:tc>
@@ -14205,12 +14514,12 @@
               <w:spacing w:line="360" w:lineRule="auto"/>
               <w:jc w:val="both"/>
               <w:rPr>
-                <w:rFonts w:ascii="Times New Roman" w:eastAsia="SimSun" w:hAnsi="Times New Roman" w:cs="Times New Roman"/>
+                <w:rFonts w:ascii="Cambria Math" w:eastAsia="SimSun" w:hAnsi="Cambria Math" w:cs="Times New Roman"/>
               </w:rPr>
             </w:pPr>
             <w:r>
               <w:rPr>
-                <w:rFonts w:ascii="Times New Roman" w:eastAsia="SimSun" w:hAnsi="Times New Roman" w:cs="Times New Roman"/>
+                <w:rFonts w:ascii="Cambria Math" w:eastAsia="SimSun" w:hAnsi="Cambria Math" w:cs="Times New Roman"/>
               </w:rPr>
               <w:t>-</w:t>
             </w:r>
@@ -14324,12 +14633,12 @@
               <w:spacing w:line="360" w:lineRule="auto"/>
               <w:jc w:val="both"/>
               <w:rPr>
-                <w:rFonts w:ascii="Times New Roman" w:eastAsia="SimSun" w:hAnsi="Times New Roman" w:cs="Times New Roman"/>
+                <w:rFonts w:ascii="Cambria Math" w:eastAsia="SimSun" w:hAnsi="Cambria Math" w:cs="Times New Roman"/>
               </w:rPr>
             </w:pPr>
             <w:r>
               <w:rPr>
-                <w:rFonts w:ascii="Times New Roman" w:eastAsia="SimSun" w:hAnsi="Times New Roman" w:cs="Times New Roman"/>
+                <w:rFonts w:ascii="Cambria Math" w:eastAsia="SimSun" w:hAnsi="Cambria Math" w:cs="Times New Roman"/>
               </w:rPr>
               <w:t>-</w:t>
             </w:r>
@@ -14413,12 +14722,12 @@
               <w:spacing w:line="360" w:lineRule="auto"/>
               <w:jc w:val="both"/>
               <w:rPr>
-                <w:rFonts w:ascii="Times New Roman" w:eastAsia="SimSun" w:hAnsi="Times New Roman" w:cs="Times New Roman"/>
+                <w:rFonts w:ascii="Cambria Math" w:eastAsia="SimSun" w:hAnsi="Cambria Math" w:cs="Times New Roman"/>
               </w:rPr>
             </w:pPr>
             <w:r>
               <w:rPr>
-                <w:rFonts w:ascii="Times New Roman" w:eastAsia="SimSun" w:hAnsi="Times New Roman" w:cs="Times New Roman"/>
+                <w:rFonts w:ascii="Cambria Math" w:eastAsia="SimSun" w:hAnsi="Cambria Math" w:cs="Times New Roman"/>
               </w:rPr>
               <w:t>100</w:t>
             </w:r>
@@ -14494,7 +14803,7 @@
               <w:spacing w:line="360" w:lineRule="auto"/>
               <w:jc w:val="both"/>
               <w:rPr>
-                <w:rFonts w:ascii="Times New Roman" w:eastAsia="SimSun" w:hAnsi="Times New Roman" w:cs="Times New Roman"/>
+                <w:rFonts w:ascii="Cambria Math" w:eastAsia="SimSun" w:hAnsi="Cambria Math" w:cs="Times New Roman"/>
               </w:rPr>
             </w:pPr>
             <m:oMathPara>
@@ -14662,12 +14971,12 @@
               <w:spacing w:line="360" w:lineRule="auto"/>
               <w:jc w:val="both"/>
               <w:rPr>
-                <w:rFonts w:ascii="Times New Roman" w:eastAsia="SimSun" w:hAnsi="Times New Roman" w:cs="Times New Roman"/>
+                <w:rFonts w:ascii="Cambria Math" w:eastAsia="SimSun" w:hAnsi="Cambria Math" w:cs="Times New Roman"/>
               </w:rPr>
             </w:pPr>
             <w:r>
               <w:rPr>
-                <w:rFonts w:ascii="Times New Roman" w:eastAsia="SimSun" w:hAnsi="Times New Roman" w:cs="Times New Roman"/>
+                <w:rFonts w:ascii="Cambria Math" w:eastAsia="SimSun" w:hAnsi="Cambria Math" w:cs="Times New Roman"/>
               </w:rPr>
               <w:t>-</w:t>
             </w:r>
@@ -14777,12 +15086,12 @@
               <w:spacing w:line="360" w:lineRule="auto"/>
               <w:jc w:val="both"/>
               <w:rPr>
-                <w:rFonts w:ascii="Times New Roman" w:eastAsia="SimSun" w:hAnsi="Times New Roman" w:cs="Times New Roman"/>
+                <w:rFonts w:ascii="Cambria Math" w:eastAsia="SimSun" w:hAnsi="Cambria Math" w:cs="Times New Roman"/>
               </w:rPr>
             </w:pPr>
             <w:r>
               <w:rPr>
-                <w:rFonts w:ascii="Times New Roman" w:eastAsia="SimSun" w:hAnsi="Times New Roman" w:cs="Times New Roman"/>
+                <w:rFonts w:ascii="Cambria Math" w:eastAsia="SimSun" w:hAnsi="Cambria Math" w:cs="Times New Roman"/>
               </w:rPr>
               <w:t>-</w:t>
             </w:r>
@@ -14824,10 +15133,7 @@
               <w:spacing w:line="360" w:lineRule="auto"/>
             </w:pPr>
             <w:r>
-              <w:t xml:space="preserve">Champ magnétique </w:t>
-            </w:r>
-            <w:r>
-              <w:t>induit par le moment dipolaire</w:t>
+              <w:t>Champ magnétique induit par le moment dipolaire</w:t>
             </w:r>
           </w:p>
         </w:tc>
@@ -14889,12 +15195,12 @@
               <w:spacing w:line="360" w:lineRule="auto"/>
               <w:jc w:val="both"/>
               <w:rPr>
-                <w:rFonts w:ascii="Times New Roman" w:eastAsia="SimSun" w:hAnsi="Times New Roman" w:cs="Times New Roman"/>
+                <w:rFonts w:ascii="Cambria Math" w:eastAsia="SimSun" w:hAnsi="Cambria Math" w:cs="Times New Roman"/>
               </w:rPr>
             </w:pPr>
             <w:r>
               <w:rPr>
-                <w:rFonts w:ascii="Times New Roman" w:eastAsia="SimSun" w:hAnsi="Times New Roman" w:cs="Times New Roman"/>
+                <w:rFonts w:ascii="Cambria Math" w:eastAsia="SimSun" w:hAnsi="Cambria Math" w:cs="Times New Roman"/>
               </w:rPr>
               <w:t>0,105</w:t>
             </w:r>
@@ -15068,16 +15374,17 @@
           <w:p>
             <w:pPr>
               <w:spacing w:line="360" w:lineRule="auto"/>
-              <w:jc w:val="both"/>
-              <w:rPr>
-                <w:rFonts w:ascii="Times New Roman" w:eastAsia="SimSun" w:hAnsi="Times New Roman" w:cs="Times New Roman"/>
+              <w:rPr>
+                <w:rFonts w:ascii="Cambria Math" w:eastAsia="SimSun" w:hAnsi="Cambria Math" w:cs="Times New Roman"/>
               </w:rPr>
             </w:pPr>
             <w:r>
               <w:rPr>
-                <w:rFonts w:ascii="Times New Roman" w:eastAsia="SimSun" w:hAnsi="Times New Roman" w:cs="Times New Roman"/>
-              </w:rPr>
-              <w:t>0,14 – 0,16</w:t>
+                <w:rFonts w:ascii="Cambria Math" w:eastAsia="SimSun" w:hAnsi="Cambria Math" w:cs="Times New Roman"/>
+                <w:sz w:val="18"/>
+                <w:szCs w:val="18"/>
+              </w:rPr>
+              <w:t>0,147 – 0,165</w:t>
             </w:r>
           </w:p>
         </w:tc>
@@ -15251,14 +15558,40 @@
               <w:spacing w:line="360" w:lineRule="auto"/>
               <w:jc w:val="both"/>
               <w:rPr>
-                <w:rFonts w:ascii="Times New Roman" w:eastAsia="SimSun" w:hAnsi="Times New Roman" w:cs="Times New Roman"/>
+                <w:rFonts w:ascii="Cambria Math" w:eastAsia="SimSun" w:hAnsi="Cambria Math" w:cs="Times New Roman"/>
               </w:rPr>
             </w:pPr>
             <w:r>
               <w:rPr>
-                <w:rFonts w:ascii="Times New Roman" w:eastAsia="SimSun" w:hAnsi="Times New Roman" w:cs="Times New Roman"/>
-              </w:rPr>
-              <w:t>?</w:t>
+                <w:rFonts w:ascii="Cambria Math" w:eastAsia="SimSun" w:hAnsi="Cambria Math" w:cs="Times New Roman"/>
+                <w:sz w:val="18"/>
+                <w:szCs w:val="18"/>
+              </w:rPr>
+              <w:t>0,</w:t>
+            </w:r>
+            <w:r>
+              <w:rPr>
+                <w:rFonts w:ascii="Cambria Math" w:eastAsia="SimSun" w:hAnsi="Cambria Math" w:cs="Times New Roman"/>
+                <w:sz w:val="18"/>
+                <w:szCs w:val="18"/>
+              </w:rPr>
+              <w:t>202</w:t>
+            </w:r>
+            <w:r>
+              <w:rPr>
+                <w:rFonts w:ascii="Cambria Math" w:eastAsia="SimSun" w:hAnsi="Cambria Math" w:cs="Times New Roman"/>
+                <w:sz w:val="18"/>
+                <w:szCs w:val="18"/>
+              </w:rPr>
+              <w:t xml:space="preserve"> – 0,</w:t>
+            </w:r>
+            <w:r>
+              <w:rPr>
+                <w:rFonts w:ascii="Cambria Math" w:eastAsia="SimSun" w:hAnsi="Cambria Math" w:cs="Times New Roman"/>
+                <w:sz w:val="18"/>
+                <w:szCs w:val="18"/>
+              </w:rPr>
+              <w:t>220</w:t>
             </w:r>
           </w:p>
         </w:tc>
@@ -15343,14 +15676,20 @@
               <w:spacing w:line="360" w:lineRule="auto"/>
               <w:jc w:val="both"/>
               <w:rPr>
-                <w:rFonts w:ascii="Times New Roman" w:eastAsia="SimSun" w:hAnsi="Times New Roman" w:cs="Times New Roman"/>
+                <w:rFonts w:ascii="Cambria Math" w:eastAsia="SimSun" w:hAnsi="Cambria Math" w:cs="Times New Roman"/>
               </w:rPr>
             </w:pPr>
             <w:r>
               <w:rPr>
-                <w:rFonts w:ascii="Times New Roman" w:eastAsia="SimSun" w:hAnsi="Times New Roman" w:cs="Times New Roman"/>
-              </w:rPr>
-              <w:t>0,02</w:t>
+                <w:rFonts w:ascii="Cambria Math" w:eastAsia="SimSun" w:hAnsi="Cambria Math" w:cs="Times New Roman"/>
+              </w:rPr>
+              <w:t>0,0</w:t>
+            </w:r>
+            <w:r>
+              <w:rPr>
+                <w:rFonts w:ascii="Cambria Math" w:eastAsia="SimSun" w:hAnsi="Cambria Math" w:cs="Times New Roman"/>
+              </w:rPr>
+              <w:t>18</w:t>
             </w:r>
           </w:p>
         </w:tc>
@@ -15452,7 +15791,7 @@
               <w:spacing w:line="360" w:lineRule="auto"/>
               <w:jc w:val="both"/>
               <w:rPr>
-                <w:rFonts w:ascii="Times New Roman" w:eastAsia="SimSun" w:hAnsi="Times New Roman" w:cs="Times New Roman"/>
+                <w:rFonts w:ascii="Cambria Math" w:eastAsia="SimSun" w:hAnsi="Cambria Math" w:cs="Times New Roman"/>
               </w:rPr>
             </w:pPr>
             <m:oMathPara>
@@ -15507,10 +15846,7 @@
               <w:jc w:val="both"/>
             </w:pPr>
             <w:r>
-              <w:t xml:space="preserve">Fréquence du champ magnétique </w:t>
-            </w:r>
-            <w:r>
-              <w:t>parasite</w:t>
+              <w:t>Fréquence du champ magnétique parasite</w:t>
             </w:r>
           </w:p>
         </w:tc>
@@ -15571,12 +15907,12 @@
             <w:pPr>
               <w:spacing w:line="360" w:lineRule="auto"/>
               <w:rPr>
-                <w:rFonts w:ascii="Times New Roman" w:eastAsia="SimSun" w:hAnsi="Times New Roman" w:cs="Times New Roman"/>
+                <w:rFonts w:ascii="Cambria Math" w:eastAsia="SimSun" w:hAnsi="Cambria Math" w:cs="Times New Roman"/>
               </w:rPr>
             </w:pPr>
             <w:r>
               <w:rPr>
-                <w:rFonts w:ascii="Times New Roman" w:eastAsia="SimSun" w:hAnsi="Times New Roman" w:cs="Times New Roman"/>
+                <w:rFonts w:ascii="Cambria Math" w:eastAsia="SimSun" w:hAnsi="Cambria Math" w:cs="Times New Roman"/>
               </w:rPr>
               <w:t>-</w:t>
             </w:r>
@@ -15619,10 +15955,7 @@
               <w:jc w:val="both"/>
             </w:pPr>
             <w:r>
-              <w:t xml:space="preserve">Amplitude du champ magnétique </w:t>
-            </w:r>
-            <w:r>
-              <w:t>parasite</w:t>
+              <w:t>Amplitude du champ magnétique parasite</w:t>
             </w:r>
           </w:p>
         </w:tc>
@@ -15663,12 +15996,12 @@
             <w:pPr>
               <w:spacing w:line="360" w:lineRule="auto"/>
               <w:rPr>
-                <w:rFonts w:ascii="Times New Roman" w:eastAsia="SimSun" w:hAnsi="Times New Roman" w:cs="Times New Roman"/>
+                <w:rFonts w:ascii="Cambria Math" w:eastAsia="SimSun" w:hAnsi="Cambria Math" w:cs="Times New Roman"/>
               </w:rPr>
             </w:pPr>
             <w:r>
               <w:rPr>
-                <w:rFonts w:ascii="Times New Roman" w:eastAsia="SimSun" w:hAnsi="Times New Roman" w:cs="Times New Roman"/>
+                <w:rFonts w:ascii="Cambria Math" w:eastAsia="SimSun" w:hAnsi="Cambria Math" w:cs="Times New Roman"/>
               </w:rPr>
               <w:t>2</w:t>
             </w:r>
@@ -15731,10 +16064,7 @@
               <w:jc w:val="both"/>
             </w:pPr>
             <w:r>
-              <w:t xml:space="preserve">Gradient du champ magnétique </w:t>
-            </w:r>
-            <w:r>
-              <w:t>parasite</w:t>
+              <w:t>Gradient du champ magnétique parasite</w:t>
             </w:r>
           </w:p>
         </w:tc>
@@ -15795,12 +16125,12 @@
             <w:pPr>
               <w:spacing w:line="360" w:lineRule="auto"/>
               <w:rPr>
-                <w:rFonts w:ascii="Times New Roman" w:eastAsia="SimSun" w:hAnsi="Times New Roman" w:cs="Times New Roman"/>
+                <w:rFonts w:ascii="Cambria Math" w:eastAsia="SimSun" w:hAnsi="Cambria Math" w:cs="Times New Roman"/>
               </w:rPr>
             </w:pPr>
             <w:r>
               <w:rPr>
-                <w:rFonts w:ascii="Times New Roman" w:eastAsia="SimSun" w:hAnsi="Times New Roman" w:cs="Times New Roman"/>
+                <w:rFonts w:ascii="Cambria Math" w:eastAsia="SimSun" w:hAnsi="Cambria Math" w:cs="Times New Roman"/>
               </w:rPr>
               <w:t>1,46</w:t>
             </w:r>
@@ -15930,12 +16260,12 @@
             <w:pPr>
               <w:spacing w:line="360" w:lineRule="auto"/>
               <w:rPr>
-                <w:rFonts w:ascii="Times New Roman" w:eastAsia="SimSun" w:hAnsi="Times New Roman" w:cs="Times New Roman"/>
+                <w:rFonts w:ascii="Cambria Math" w:eastAsia="SimSun" w:hAnsi="Cambria Math" w:cs="Times New Roman"/>
               </w:rPr>
             </w:pPr>
             <w:r>
               <w:rPr>
-                <w:rFonts w:ascii="Times New Roman" w:eastAsia="SimSun" w:hAnsi="Times New Roman" w:cs="Times New Roman"/>
+                <w:rFonts w:ascii="Cambria Math" w:eastAsia="SimSun" w:hAnsi="Cambria Math" w:cs="Times New Roman"/>
               </w:rPr>
               <w:t>0,02</w:t>
             </w:r>
@@ -16065,12 +16395,12 @@
             <w:pPr>
               <w:spacing w:line="360" w:lineRule="auto"/>
               <w:rPr>
-                <w:rFonts w:ascii="Times New Roman" w:eastAsia="SimSun" w:hAnsi="Times New Roman" w:cs="Times New Roman"/>
+                <w:rFonts w:ascii="Cambria Math" w:eastAsia="SimSun" w:hAnsi="Cambria Math" w:cs="Times New Roman"/>
               </w:rPr>
             </w:pPr>
             <w:r>
               <w:rPr>
-                <w:rFonts w:ascii="Times New Roman" w:eastAsia="SimSun" w:hAnsi="Times New Roman" w:cs="Times New Roman"/>
+                <w:rFonts w:ascii="Cambria Math" w:eastAsia="SimSun" w:hAnsi="Cambria Math" w:cs="Times New Roman"/>
               </w:rPr>
               <w:t>?</w:t>
             </w:r>
@@ -16200,12 +16530,12 @@
             <w:pPr>
               <w:spacing w:line="360" w:lineRule="auto"/>
               <w:rPr>
-                <w:rFonts w:ascii="Times New Roman" w:eastAsia="SimSun" w:hAnsi="Times New Roman" w:cs="Times New Roman"/>
+                <w:rFonts w:ascii="Cambria Math" w:eastAsia="SimSun" w:hAnsi="Cambria Math" w:cs="Times New Roman"/>
               </w:rPr>
             </w:pPr>
             <w:r>
               <w:rPr>
-                <w:rFonts w:ascii="Times New Roman" w:eastAsia="SimSun" w:hAnsi="Times New Roman" w:cs="Times New Roman"/>
+                <w:rFonts w:ascii="Cambria Math" w:eastAsia="SimSun" w:hAnsi="Cambria Math" w:cs="Times New Roman"/>
               </w:rPr>
               <w:t>1,48</w:t>
             </w:r>
@@ -16335,12 +16665,12 @@
             <w:pPr>
               <w:spacing w:line="360" w:lineRule="auto"/>
               <w:rPr>
-                <w:rFonts w:ascii="Times New Roman" w:eastAsia="SimSun" w:hAnsi="Times New Roman" w:cs="Times New Roman"/>
+                <w:rFonts w:ascii="Cambria Math" w:eastAsia="SimSun" w:hAnsi="Cambria Math" w:cs="Times New Roman"/>
               </w:rPr>
             </w:pPr>
             <w:r>
               <w:rPr>
-                <w:rFonts w:ascii="Times New Roman" w:eastAsia="SimSun" w:hAnsi="Times New Roman" w:cs="Times New Roman"/>
+                <w:rFonts w:ascii="Cambria Math" w:eastAsia="SimSun" w:hAnsi="Cambria Math" w:cs="Times New Roman"/>
               </w:rPr>
               <w:t>0,62</w:t>
             </w:r>
@@ -16409,16 +16739,7 @@
               <w:jc w:val="both"/>
             </w:pPr>
             <w:r>
-              <w:t>Sensibilité</w:t>
-            </w:r>
-            <w:r>
-              <w:t xml:space="preserve"> expérimentale</w:t>
-            </w:r>
-            <w:r>
-              <w:t xml:space="preserve"> du </w:t>
-            </w:r>
-            <w:r>
-              <w:t>Humbucker parallèle</w:t>
+              <w:t>Sensibilité expérimentale du Humbucker parallèle</w:t>
             </w:r>
           </w:p>
         </w:tc>
@@ -16479,12 +16800,12 @@
             <w:pPr>
               <w:spacing w:line="360" w:lineRule="auto"/>
               <w:rPr>
-                <w:rFonts w:ascii="Times New Roman" w:eastAsia="SimSun" w:hAnsi="Times New Roman" w:cs="Times New Roman"/>
+                <w:rFonts w:ascii="Cambria Math" w:eastAsia="SimSun" w:hAnsi="Cambria Math" w:cs="Times New Roman"/>
               </w:rPr>
             </w:pPr>
             <w:r>
               <w:rPr>
-                <w:rFonts w:ascii="Times New Roman" w:eastAsia="SimSun" w:hAnsi="Times New Roman" w:cs="Times New Roman"/>
+                <w:rFonts w:ascii="Cambria Math" w:eastAsia="SimSun" w:hAnsi="Cambria Math" w:cs="Times New Roman"/>
               </w:rPr>
               <w:t>?</w:t>
             </w:r>
@@ -16553,16 +16874,7 @@
               <w:jc w:val="both"/>
             </w:pPr>
             <w:r>
-              <w:t xml:space="preserve">Sensibilité </w:t>
-            </w:r>
-            <w:r>
-              <w:t xml:space="preserve">expérimentale </w:t>
-            </w:r>
-            <w:r>
-              <w:t xml:space="preserve">du </w:t>
-            </w:r>
-            <w:r>
-              <w:t>Humbucker série</w:t>
+              <w:t>Sensibilité expérimentale du Humbucker série</w:t>
             </w:r>
           </w:p>
         </w:tc>
@@ -16603,12 +16915,12 @@
             <w:pPr>
               <w:spacing w:line="360" w:lineRule="auto"/>
               <w:rPr>
-                <w:rFonts w:ascii="Times New Roman" w:eastAsia="SimSun" w:hAnsi="Times New Roman" w:cs="Times New Roman"/>
+                <w:rFonts w:ascii="Cambria Math" w:eastAsia="SimSun" w:hAnsi="Cambria Math" w:cs="Times New Roman"/>
               </w:rPr>
             </w:pPr>
             <w:r>
               <w:rPr>
-                <w:rFonts w:ascii="Times New Roman" w:eastAsia="SimSun" w:hAnsi="Times New Roman" w:cs="Times New Roman"/>
+                <w:rFonts w:ascii="Cambria Math" w:eastAsia="SimSun" w:hAnsi="Cambria Math" w:cs="Times New Roman"/>
               </w:rPr>
               <w:t>37</w:t>
             </w:r>
@@ -16651,10 +16963,7 @@
               <w:jc w:val="both"/>
             </w:pPr>
             <w:r>
-              <w:t>CMRR</w:t>
-            </w:r>
-            <w:r>
-              <w:t xml:space="preserve"> théorique du Humbucker</w:t>
+              <w:t>CMRR théorique du Humbucker</w:t>
             </w:r>
           </w:p>
         </w:tc>
@@ -16718,12 +17027,12 @@
             <w:pPr>
               <w:spacing w:line="360" w:lineRule="auto"/>
               <w:rPr>
-                <w:rFonts w:ascii="Times New Roman" w:eastAsia="SimSun" w:hAnsi="Times New Roman" w:cs="Times New Roman"/>
+                <w:rFonts w:ascii="Cambria Math" w:eastAsia="SimSun" w:hAnsi="Cambria Math" w:cs="Times New Roman"/>
               </w:rPr>
             </w:pPr>
             <w:r>
               <w:rPr>
-                <w:rFonts w:ascii="Times New Roman" w:eastAsia="SimSun" w:hAnsi="Times New Roman" w:cs="Times New Roman"/>
+                <w:rFonts w:ascii="Cambria Math" w:eastAsia="SimSun" w:hAnsi="Cambria Math" w:cs="Times New Roman"/>
               </w:rPr>
               <w:t>7,6</w:t>
             </w:r>
@@ -16766,10 +17075,7 @@
               <w:jc w:val="both"/>
             </w:pPr>
             <w:r>
-              <w:t>CMRR</w:t>
-            </w:r>
-            <w:r>
-              <w:t xml:space="preserve"> expérimentale du Humbucker parallèle</w:t>
+              <w:t>CMRR expérimentale du Humbucker parallèle</w:t>
             </w:r>
           </w:p>
         </w:tc>
@@ -16833,12 +17139,12 @@
             <w:pPr>
               <w:spacing w:line="360" w:lineRule="auto"/>
               <w:rPr>
-                <w:rFonts w:ascii="Times New Roman" w:eastAsia="SimSun" w:hAnsi="Times New Roman" w:cs="Times New Roman"/>
+                <w:rFonts w:ascii="Cambria Math" w:eastAsia="SimSun" w:hAnsi="Cambria Math" w:cs="Times New Roman"/>
               </w:rPr>
             </w:pPr>
             <w:r>
               <w:rPr>
-                <w:rFonts w:ascii="Times New Roman" w:eastAsia="SimSun" w:hAnsi="Times New Roman" w:cs="Times New Roman"/>
+                <w:rFonts w:ascii="Cambria Math" w:eastAsia="SimSun" w:hAnsi="Cambria Math" w:cs="Times New Roman"/>
               </w:rPr>
               <w:t>?</w:t>
             </w:r>
@@ -16881,10 +17187,7 @@
               <w:jc w:val="both"/>
             </w:pPr>
             <w:r>
-              <w:t>CMRR</w:t>
-            </w:r>
-            <w:r>
-              <w:t xml:space="preserve"> expérimentale du Humbucker série</w:t>
+              <w:t>CMRR expérimentale du Humbucker série</w:t>
             </w:r>
           </w:p>
         </w:tc>
@@ -17095,7 +17398,7 @@
       <w:r>
         <w:t xml:space="preserve">[En ligne]. Disponible sur : </w:t>
       </w:r>
-      <w:hyperlink r:id="rId24" w:history="1">
+      <w:hyperlink r:id="rId26" w:history="1">
         <w:r>
           <w:rPr>
             <w:rStyle w:val="Hyperlink"/>
@@ -17169,60 +17472,15 @@
       <w:pPr>
         <w:pStyle w:val="Bibliography"/>
         <w:spacing w:line="360" w:lineRule="auto"/>
+        <w:ind w:left="0" w:firstLine="0"/>
         <w:rPr>
           <w:lang w:val="en-GB"/>
         </w:rPr>
       </w:pPr>
-      <w:r>
-        <w:rPr>
-          <w:lang w:val="en-GB"/>
-        </w:rPr>
-        <w:t>[</w:t>
-      </w:r>
-      <w:r>
-        <w:rPr>
-          <w:lang w:val="en-GB"/>
-        </w:rPr>
-        <w:t>7</w:t>
-      </w:r>
-      <w:r>
-        <w:rPr>
-          <w:lang w:val="en-GB"/>
-        </w:rPr>
-        <w:t>] N. G. Horton and T. R. Moore, “</w:t>
-      </w:r>
-      <w:proofErr w:type="spellStart"/>
-      <w:r>
-        <w:rPr>
-          <w:lang w:val="en-GB"/>
-        </w:rPr>
-        <w:t>Modeling</w:t>
-      </w:r>
-      <w:proofErr w:type="spellEnd"/>
-      <w:r>
-        <w:rPr>
-          <w:lang w:val="en-GB"/>
-        </w:rPr>
-        <w:t xml:space="preserve"> the magnetic pickup of an electric guitar,” American Journal of Physics, vol. 77, no. 2, pp. 144–150, 2009, </w:t>
-      </w:r>
-      <w:proofErr w:type="spellStart"/>
-      <w:r>
-        <w:rPr>
-          <w:lang w:val="en-GB"/>
-        </w:rPr>
-        <w:t>doi</w:t>
-      </w:r>
-      <w:proofErr w:type="spellEnd"/>
-      <w:r>
-        <w:rPr>
-          <w:lang w:val="en-GB"/>
-        </w:rPr>
-        <w:t>: 10.1119/1.2990663.</w:t>
-      </w:r>
     </w:p>
     <w:sectPr>
-      <w:headerReference w:type="default" r:id="rId25"/>
-      <w:headerReference w:type="first" r:id="rId26"/>
+      <w:headerReference w:type="default" r:id="rId27"/>
+      <w:headerReference w:type="first" r:id="rId28"/>
       <w:footnotePr>
         <w:pos w:val="beneathText"/>
       </w:footnotePr>
@@ -21803,6 +22061,7 @@
     <w:rsid w:val="00006E37"/>
     <w:rsid w:val="0004071B"/>
     <w:rsid w:val="000900BC"/>
+    <w:rsid w:val="0019392E"/>
     <w:rsid w:val="0021758C"/>
     <w:rsid w:val="002949D4"/>
     <w:rsid w:val="003801CD"/>
@@ -21817,6 +22076,7 @@
     <w:rsid w:val="00645F4A"/>
     <w:rsid w:val="006834EA"/>
     <w:rsid w:val="006C418E"/>
+    <w:rsid w:val="006D2BB8"/>
     <w:rsid w:val="007D44B8"/>
     <w:rsid w:val="007F6A90"/>
     <w:rsid w:val="0095201F"/>
@@ -21828,6 +22088,7 @@
     <w:rsid w:val="00D1619A"/>
     <w:rsid w:val="00E818CA"/>
     <w:rsid w:val="00F3352B"/>
+    <w:rsid w:val="00FB4268"/>
   </w:rsids>
   <m:mathPr>
     <m:mathFont m:val="Cambria Math"/>
@@ -22303,7 +22564,7 @@
     <w:basedOn w:val="DefaultParagraphFont"/>
     <w:uiPriority w:val="99"/>
     <w:semiHidden/>
-    <w:rsid w:val="009E592E"/>
+    <w:rsid w:val="0019392E"/>
     <w:rPr>
       <w:color w:val="404040" w:themeColor="text1" w:themeTint="BF"/>
     </w:rPr>

</xml_diff>